<commit_message>
Agrega imágenes y rótulos de ilustraciones; actualiza informe
</commit_message>
<xml_diff>
--- a/PDS_Actividad_01_Grupo2.docx
+++ b/PDS_Actividad_01_Grupo2.docx
@@ -84,47 +84,7 @@
           <w:sz w:val="24"/>
           <w:szCs w:val="24"/>
         </w:rPr>
-        <w:t xml:space="preserve"> </w:t>
-      </w:r>
-      <w:r>
-        <w:rPr>
-          <w:rFonts w:ascii="Times New Roman" w:hAnsi="Times New Roman" w:cs="Times New Roman"/>
-          <w:sz w:val="24"/>
-          <w:szCs w:val="24"/>
-        </w:rPr>
-        <w:t xml:space="preserve">La empresa </w:t>
-      </w:r>
-      <w:r>
-        <w:rPr>
-          <w:rFonts w:ascii="Times New Roman" w:hAnsi="Times New Roman" w:cs="Times New Roman"/>
-          <w:sz w:val="24"/>
-          <w:szCs w:val="24"/>
-        </w:rPr>
-        <w:t xml:space="preserve">tiene que </w:t>
-      </w:r>
-      <w:r>
-        <w:rPr>
-          <w:rFonts w:ascii="Times New Roman" w:hAnsi="Times New Roman" w:cs="Times New Roman"/>
-          <w:sz w:val="24"/>
-          <w:szCs w:val="24"/>
-        </w:rPr>
-        <w:t>registrar diferentes tipos de vehículos y calcular el valor correspondiente a su matrícula.</w:t>
-      </w:r>
-      <w:r>
-        <w:rPr>
-          <w:rFonts w:ascii="Times New Roman" w:hAnsi="Times New Roman" w:cs="Times New Roman"/>
-          <w:sz w:val="24"/>
-          <w:szCs w:val="24"/>
-        </w:rPr>
-        <w:t xml:space="preserve"> E</w:t>
-      </w:r>
-      <w:r>
-        <w:rPr>
-          <w:rFonts w:ascii="Times New Roman" w:hAnsi="Times New Roman" w:cs="Times New Roman"/>
-          <w:sz w:val="24"/>
-          <w:szCs w:val="24"/>
-        </w:rPr>
-        <w:t xml:space="preserve">l sistema trabaja con tres tipos de vehículos: </w:t>
+        <w:t xml:space="preserve"> La empresa tiene que registrar diferentes tipos de vehículos y calcular el valor correspondiente a su matrícula. El sistema trabaja con tres tipos de vehículos: </w:t>
       </w:r>
     </w:p>
     <w:p>
@@ -147,15 +107,7 @@
           <w:sz w:val="24"/>
           <w:szCs w:val="24"/>
         </w:rPr>
-        <w:t>Auto</w:t>
-      </w:r>
-      <w:r>
-        <w:rPr>
-          <w:rFonts w:ascii="Times New Roman" w:hAnsi="Times New Roman" w:cs="Times New Roman"/>
-          <w:sz w:val="24"/>
-          <w:szCs w:val="24"/>
-        </w:rPr>
-        <w:t>.</w:t>
+        <w:t>Auto.</w:t>
       </w:r>
     </w:p>
     <w:p>
@@ -178,15 +130,7 @@
           <w:sz w:val="24"/>
           <w:szCs w:val="24"/>
         </w:rPr>
-        <w:t>Camioneta</w:t>
-      </w:r>
-      <w:r>
-        <w:rPr>
-          <w:rFonts w:ascii="Times New Roman" w:hAnsi="Times New Roman" w:cs="Times New Roman"/>
-          <w:sz w:val="24"/>
-          <w:szCs w:val="24"/>
-        </w:rPr>
-        <w:t>.</w:t>
+        <w:t>Camioneta.</w:t>
       </w:r>
     </w:p>
     <w:p>
@@ -250,31 +194,7 @@
           <w:sz w:val="24"/>
           <w:szCs w:val="24"/>
         </w:rPr>
-        <w:t>Aunque comparten características generales, cada tipo posee particularidades que afectan el cálculo de su matrícula.</w:t>
-      </w:r>
-      <w:r>
-        <w:rPr>
-          <w:rFonts w:ascii="Times New Roman" w:hAnsi="Times New Roman" w:cs="Times New Roman"/>
-          <w:sz w:val="24"/>
-          <w:szCs w:val="24"/>
-        </w:rPr>
-        <w:t xml:space="preserve"> </w:t>
-      </w:r>
-      <w:r>
-        <w:rPr>
-          <w:rFonts w:ascii="Times New Roman" w:hAnsi="Times New Roman" w:cs="Times New Roman"/>
-          <w:sz w:val="24"/>
-          <w:szCs w:val="24"/>
-        </w:rPr>
-        <w:t xml:space="preserve">El problema principal no es únicamente calcular ese valor, sino cómo crear diferentes tipos de objetos durante la </w:t>
-      </w:r>
-      <w:r>
-        <w:rPr>
-          <w:rFonts w:ascii="Times New Roman" w:hAnsi="Times New Roman" w:cs="Times New Roman"/>
-          <w:sz w:val="24"/>
-          <w:szCs w:val="24"/>
-        </w:rPr>
-        <w:t>EJECUCIÓN (</w:t>
+        <w:t>Aunque comparten características generales, cada tipo posee particularidades que afectan el cálculo de su matrícula. El problema principal no es únicamente calcular ese valor, sino cómo crear diferentes tipos de objetos durante la EJECUCIÓN (</w:t>
       </w:r>
       <w:r>
         <w:rPr>
@@ -290,15 +210,7 @@
           <w:sz w:val="24"/>
           <w:szCs w:val="24"/>
         </w:rPr>
-        <w:t>alabra clave que nos indica que patrón de diseño se debe aplicar)</w:t>
-      </w:r>
-      <w:r>
-        <w:rPr>
-          <w:rFonts w:ascii="Times New Roman" w:hAnsi="Times New Roman" w:cs="Times New Roman"/>
-          <w:sz w:val="24"/>
-          <w:szCs w:val="24"/>
-        </w:rPr>
-        <w:t xml:space="preserve"> sin que la lógica principal dependa directamente de sus clases concretas.</w:t>
+        <w:t>alabra clave que nos indica que patrón de diseño se debe aplicar) sin que la lógica principal dependa directamente de sus clases concretas.</w:t>
       </w:r>
     </w:p>
     <w:p>
@@ -505,23 +417,7 @@
           <w:sz w:val="24"/>
           <w:szCs w:val="24"/>
         </w:rPr>
-        <w:t xml:space="preserve">Evitar que la lógica principal dependa de las clases concretas Auto, Camioneta y </w:t>
-      </w:r>
-      <w:r>
-        <w:rPr>
-          <w:rFonts w:ascii="Times New Roman" w:hAnsi="Times New Roman" w:cs="Times New Roman"/>
-          <w:sz w:val="24"/>
-          <w:szCs w:val="24"/>
-        </w:rPr>
-        <w:t>Camión</w:t>
-      </w:r>
-      <w:r>
-        <w:rPr>
-          <w:rFonts w:ascii="Times New Roman" w:hAnsi="Times New Roman" w:cs="Times New Roman"/>
-          <w:sz w:val="24"/>
-          <w:szCs w:val="24"/>
-        </w:rPr>
-        <w:t>.</w:t>
+        <w:t>Evitar que la lógica principal dependa de las clases concretas Auto, Camioneta y Camión.</w:t>
       </w:r>
     </w:p>
     <w:p>
@@ -1390,16 +1286,7 @@
                 <w:szCs w:val="24"/>
                 <w:lang w:eastAsia="es-EC"/>
               </w:rPr>
-              <w:t xml:space="preserve">Auto, Camioneta, </w:t>
-            </w:r>
-            <w:r>
-              <w:rPr>
-                <w:rFonts w:ascii="Times New Roman" w:eastAsia="Times New Roman" w:hAnsi="Times New Roman" w:cs="Times New Roman"/>
-                <w:sz w:val="24"/>
-                <w:szCs w:val="24"/>
-                <w:lang w:eastAsia="es-EC"/>
-              </w:rPr>
-              <w:t>Camión</w:t>
+              <w:t>Auto, Camioneta, Camión</w:t>
             </w:r>
           </w:p>
         </w:tc>
@@ -1600,21 +1487,21 @@
     </w:p>
     <w:p>
       <w:pPr>
-        <w:jc w:val="both"/>
-        <w:rPr>
-          <w:rFonts w:ascii="Times New Roman" w:hAnsi="Times New Roman" w:cs="Times New Roman"/>
-          <w:sz w:val="24"/>
-          <w:szCs w:val="24"/>
-        </w:rPr>
-      </w:pPr>
-      <w:r>
-        <w:rPr>
-          <w:rFonts w:ascii="Times New Roman" w:hAnsi="Times New Roman" w:cs="Times New Roman"/>
+        <w:keepNext/>
+        <w:jc w:val="both"/>
+        <w:rPr>
+          <w:rFonts w:ascii="Times New Roman" w:hAnsi="Times New Roman" w:cs="Times New Roman"/>
+        </w:rPr>
+      </w:pPr>
+      <w:r>
+        <w:rPr>
+          <w:rFonts w:ascii="Times New Roman" w:hAnsi="Times New Roman" w:cs="Times New Roman"/>
+          <w:noProof/>
           <w:sz w:val="24"/>
           <w:szCs w:val="24"/>
         </w:rPr>
         <w:drawing>
-          <wp:inline distT="0" distB="0" distL="0" distR="0" wp14:anchorId="5D9E3885" wp14:editId="6910ABCF">
+          <wp:inline distT="0" distB="0" distL="0" distR="0" wp14:anchorId="32691AEA" wp14:editId="053A4A45">
             <wp:extent cx="5731510" cy="3112770"/>
             <wp:effectExtent l="0" t="0" r="2540" b="0"/>
             <wp:docPr id="1" name="Imagen 1"/>
@@ -1629,7 +1516,7 @@
                     <pic:cNvPicPr/>
                   </pic:nvPicPr>
                   <pic:blipFill>
-                    <a:blip r:embed="rId5"/>
+                    <a:blip r:embed="rId6"/>
                     <a:stretch>
                       <a:fillRect/>
                     </a:stretch>
@@ -1652,6 +1539,627 @@
     </w:p>
     <w:p>
       <w:pPr>
+        <w:pStyle w:val="Descripcin"/>
+        <w:jc w:val="center"/>
+        <w:rPr>
+          <w:rFonts w:ascii="Times New Roman" w:hAnsi="Times New Roman" w:cs="Times New Roman"/>
+          <w:sz w:val="24"/>
+          <w:szCs w:val="24"/>
+        </w:rPr>
+      </w:pPr>
+      <w:r>
+        <w:rPr>
+          <w:rFonts w:ascii="Times New Roman" w:hAnsi="Times New Roman" w:cs="Times New Roman"/>
+        </w:rPr>
+        <w:t xml:space="preserve">Ilustración </w:t>
+      </w:r>
+      <w:r>
+        <w:rPr>
+          <w:rFonts w:ascii="Times New Roman" w:hAnsi="Times New Roman" w:cs="Times New Roman"/>
+        </w:rPr>
+        <w:fldChar w:fldCharType="begin"/>
+      </w:r>
+      <w:r>
+        <w:rPr>
+          <w:rFonts w:ascii="Times New Roman" w:hAnsi="Times New Roman" w:cs="Times New Roman"/>
+        </w:rPr>
+        <w:instrText xml:space="preserve"> SEQ Ilustración \* ARABIC </w:instrText>
+      </w:r>
+      <w:r>
+        <w:rPr>
+          <w:rFonts w:ascii="Times New Roman" w:hAnsi="Times New Roman" w:cs="Times New Roman"/>
+        </w:rPr>
+        <w:fldChar w:fldCharType="separate"/>
+      </w:r>
+      <w:r>
+        <w:rPr>
+          <w:rFonts w:ascii="Times New Roman" w:hAnsi="Times New Roman" w:cs="Times New Roman"/>
+          <w:noProof/>
+        </w:rPr>
+        <w:t>1</w:t>
+      </w:r>
+      <w:r>
+        <w:rPr>
+          <w:rFonts w:ascii="Times New Roman" w:hAnsi="Times New Roman" w:cs="Times New Roman"/>
+        </w:rPr>
+        <w:fldChar w:fldCharType="end"/>
+      </w:r>
+      <w:r>
+        <w:rPr>
+          <w:rFonts w:ascii="Times New Roman" w:hAnsi="Times New Roman" w:cs="Times New Roman"/>
+        </w:rPr>
+        <w:t xml:space="preserve">. Diagrama Factory </w:t>
+      </w:r>
+      <w:proofErr w:type="spellStart"/>
+      <w:r>
+        <w:rPr>
+          <w:rFonts w:ascii="Times New Roman" w:hAnsi="Times New Roman" w:cs="Times New Roman"/>
+        </w:rPr>
+        <w:t>Method</w:t>
+      </w:r>
+      <w:proofErr w:type="spellEnd"/>
+      <w:r>
+        <w:rPr>
+          <w:rFonts w:ascii="Times New Roman" w:hAnsi="Times New Roman" w:cs="Times New Roman"/>
+        </w:rPr>
+        <w:t xml:space="preserve"> inicial</w:t>
+      </w:r>
+    </w:p>
+    <w:p>
+      <w:pPr>
+        <w:keepNext/>
+        <w:jc w:val="both"/>
+        <w:rPr>
+          <w:rFonts w:ascii="Times New Roman" w:hAnsi="Times New Roman" w:cs="Times New Roman"/>
+        </w:rPr>
+      </w:pPr>
+      <w:r>
+        <w:rPr>
+          <w:rFonts w:ascii="Times New Roman" w:hAnsi="Times New Roman" w:cs="Times New Roman"/>
+          <w:noProof/>
+        </w:rPr>
+        <w:lastRenderedPageBreak/>
+        <w:drawing>
+          <wp:inline distT="0" distB="0" distL="0" distR="0" wp14:anchorId="768EAE70" wp14:editId="5000E64E">
+            <wp:extent cx="5731510" cy="1112520"/>
+            <wp:effectExtent l="0" t="0" r="2540" b="0"/>
+            <wp:docPr id="5" name="Imagen 5"/>
+            <wp:cNvGraphicFramePr>
+              <a:graphicFrameLocks xmlns:a="http://schemas.openxmlformats.org/drawingml/2006/main" noChangeAspect="1"/>
+            </wp:cNvGraphicFramePr>
+            <a:graphic xmlns:a="http://schemas.openxmlformats.org/drawingml/2006/main">
+              <a:graphicData uri="http://schemas.openxmlformats.org/drawingml/2006/picture">
+                <pic:pic xmlns:pic="http://schemas.openxmlformats.org/drawingml/2006/picture">
+                  <pic:nvPicPr>
+                    <pic:cNvPr id="0" name="Picture 1"/>
+                    <pic:cNvPicPr>
+                      <a:picLocks noChangeAspect="1" noChangeArrowheads="1"/>
+                    </pic:cNvPicPr>
+                  </pic:nvPicPr>
+                  <pic:blipFill>
+                    <a:blip r:embed="rId7" cstate="print">
+                      <a:extLst>
+                        <a:ext uri="{28A0092B-C50C-407E-A947-70E740481C1C}">
+                          <a14:useLocalDpi xmlns:a14="http://schemas.microsoft.com/office/drawing/2010/main" val="0"/>
+                        </a:ext>
+                      </a:extLst>
+                    </a:blip>
+                    <a:srcRect/>
+                    <a:stretch>
+                      <a:fillRect/>
+                    </a:stretch>
+                  </pic:blipFill>
+                  <pic:spPr bwMode="auto">
+                    <a:xfrm>
+                      <a:off x="0" y="0"/>
+                      <a:ext cx="5731510" cy="1112520"/>
+                    </a:xfrm>
+                    <a:prstGeom prst="rect">
+                      <a:avLst/>
+                    </a:prstGeom>
+                    <a:noFill/>
+                    <a:ln>
+                      <a:noFill/>
+                    </a:ln>
+                  </pic:spPr>
+                </pic:pic>
+              </a:graphicData>
+            </a:graphic>
+          </wp:inline>
+        </w:drawing>
+      </w:r>
+    </w:p>
+    <w:p>
+      <w:pPr>
+        <w:pStyle w:val="Descripcin"/>
+        <w:jc w:val="center"/>
+        <w:rPr>
+          <w:rFonts w:ascii="Times New Roman" w:hAnsi="Times New Roman" w:cs="Times New Roman"/>
+          <w:sz w:val="24"/>
+          <w:szCs w:val="24"/>
+        </w:rPr>
+      </w:pPr>
+      <w:r>
+        <w:rPr>
+          <w:rFonts w:ascii="Times New Roman" w:hAnsi="Times New Roman" w:cs="Times New Roman"/>
+        </w:rPr>
+        <w:t xml:space="preserve">Ilustración </w:t>
+      </w:r>
+      <w:r>
+        <w:rPr>
+          <w:rFonts w:ascii="Times New Roman" w:hAnsi="Times New Roman" w:cs="Times New Roman"/>
+        </w:rPr>
+        <w:fldChar w:fldCharType="begin"/>
+      </w:r>
+      <w:r>
+        <w:rPr>
+          <w:rFonts w:ascii="Times New Roman" w:hAnsi="Times New Roman" w:cs="Times New Roman"/>
+        </w:rPr>
+        <w:instrText xml:space="preserve"> SEQ Ilustración \* ARABIC </w:instrText>
+      </w:r>
+      <w:r>
+        <w:rPr>
+          <w:rFonts w:ascii="Times New Roman" w:hAnsi="Times New Roman" w:cs="Times New Roman"/>
+        </w:rPr>
+        <w:fldChar w:fldCharType="separate"/>
+      </w:r>
+      <w:r>
+        <w:rPr>
+          <w:rFonts w:ascii="Times New Roman" w:hAnsi="Times New Roman" w:cs="Times New Roman"/>
+          <w:noProof/>
+        </w:rPr>
+        <w:t>2</w:t>
+      </w:r>
+      <w:r>
+        <w:rPr>
+          <w:rFonts w:ascii="Times New Roman" w:hAnsi="Times New Roman" w:cs="Times New Roman"/>
+        </w:rPr>
+        <w:fldChar w:fldCharType="end"/>
+      </w:r>
+      <w:r>
+        <w:rPr>
+          <w:rFonts w:ascii="Times New Roman" w:hAnsi="Times New Roman" w:cs="Times New Roman"/>
+        </w:rPr>
+        <w:t xml:space="preserve">. Diagrama Factory </w:t>
+      </w:r>
+      <w:proofErr w:type="spellStart"/>
+      <w:r>
+        <w:rPr>
+          <w:rFonts w:ascii="Times New Roman" w:hAnsi="Times New Roman" w:cs="Times New Roman"/>
+        </w:rPr>
+        <w:t>Method</w:t>
+      </w:r>
+      <w:proofErr w:type="spellEnd"/>
+      <w:r>
+        <w:rPr>
+          <w:rFonts w:ascii="Times New Roman" w:hAnsi="Times New Roman" w:cs="Times New Roman"/>
+        </w:rPr>
+        <w:t xml:space="preserve"> Final</w:t>
+      </w:r>
+    </w:p>
+    <w:p>
+      <w:pPr>
+        <w:pStyle w:val="Prrafodelista"/>
+        <w:numPr>
+          <w:ilvl w:val="0"/>
+          <w:numId w:val="2"/>
+        </w:numPr>
+        <w:jc w:val="both"/>
+        <w:rPr>
+          <w:rFonts w:ascii="Times New Roman" w:eastAsia="Times New Roman" w:hAnsi="Times New Roman" w:cs="Times New Roman"/>
+          <w:sz w:val="24"/>
+          <w:szCs w:val="24"/>
+        </w:rPr>
+      </w:pPr>
+      <w:r>
+        <w:rPr>
+          <w:rFonts w:ascii="Times New Roman" w:eastAsia="Times New Roman" w:hAnsi="Times New Roman" w:cs="Times New Roman"/>
+          <w:sz w:val="24"/>
+          <w:szCs w:val="24"/>
+        </w:rPr>
+        <w:t>Código fuente</w:t>
+      </w:r>
+    </w:p>
+    <w:p>
+      <w:pPr>
+        <w:spacing w:before="100" w:beforeAutospacing="1" w:after="100" w:afterAutospacing="1" w:line="240" w:lineRule="auto"/>
+        <w:jc w:val="both"/>
+        <w:rPr>
+          <w:rFonts w:ascii="Times New Roman" w:eastAsia="Times New Roman" w:hAnsi="Times New Roman" w:cs="Times New Roman"/>
+          <w:sz w:val="24"/>
+          <w:szCs w:val="24"/>
+          <w:lang w:eastAsia="es-EC"/>
+        </w:rPr>
+      </w:pPr>
+      <w:r>
+        <w:rPr>
+          <w:rFonts w:ascii="Times New Roman" w:eastAsia="Times New Roman" w:hAnsi="Times New Roman" w:cs="Times New Roman"/>
+          <w:sz w:val="24"/>
+          <w:szCs w:val="24"/>
+          <w:lang w:eastAsia="es-EC"/>
+        </w:rPr>
+        <w:t>El código está en codigo-escenario-1/ (Java 17+, paquete vehiculos). Correspondencia con el diagrama:</w:t>
+      </w:r>
+    </w:p>
+    <w:tbl>
+      <w:tblPr>
+        <w:tblStyle w:val="Tablaconcuadrcula"/>
+        <w:tblW w:w="9067" w:type="dxa"/>
+        <w:tblLook w:val="04A0" w:firstRow="1" w:lastRow="0" w:firstColumn="1" w:lastColumn="0" w:noHBand="0" w:noVBand="1"/>
+      </w:tblPr>
+      <w:tblGrid>
+        <w:gridCol w:w="3256"/>
+        <w:gridCol w:w="5811"/>
+      </w:tblGrid>
+      <w:tr>
+        <w:tc>
+          <w:tcPr>
+            <w:tcW w:w="3256" w:type="dxa"/>
+          </w:tcPr>
+          <w:p>
+            <w:pPr>
+              <w:spacing w:before="100" w:beforeAutospacing="1" w:after="100" w:afterAutospacing="1"/>
+              <w:jc w:val="both"/>
+              <w:rPr>
+                <w:rFonts w:ascii="Times New Roman" w:eastAsia="Times New Roman" w:hAnsi="Times New Roman" w:cs="Times New Roman"/>
+                <w:b/>
+                <w:bCs/>
+                <w:sz w:val="24"/>
+                <w:szCs w:val="24"/>
+                <w:lang w:eastAsia="es-EC"/>
+              </w:rPr>
+            </w:pPr>
+            <w:r>
+              <w:rPr>
+                <w:rFonts w:ascii="Times New Roman" w:eastAsia="Times New Roman" w:hAnsi="Times New Roman" w:cs="Times New Roman"/>
+                <w:b/>
+                <w:bCs/>
+                <w:sz w:val="24"/>
+                <w:szCs w:val="24"/>
+                <w:lang w:eastAsia="es-EC"/>
+              </w:rPr>
+              <w:t>Participante</w:t>
+            </w:r>
+          </w:p>
+        </w:tc>
+        <w:tc>
+          <w:tcPr>
+            <w:tcW w:w="5811" w:type="dxa"/>
+          </w:tcPr>
+          <w:p>
+            <w:pPr>
+              <w:spacing w:before="100" w:beforeAutospacing="1" w:after="100" w:afterAutospacing="1"/>
+              <w:jc w:val="both"/>
+              <w:rPr>
+                <w:rFonts w:ascii="Times New Roman" w:eastAsia="Times New Roman" w:hAnsi="Times New Roman" w:cs="Times New Roman"/>
+                <w:b/>
+                <w:bCs/>
+                <w:sz w:val="24"/>
+                <w:szCs w:val="24"/>
+                <w:lang w:eastAsia="es-EC"/>
+              </w:rPr>
+            </w:pPr>
+            <w:r>
+              <w:rPr>
+                <w:rFonts w:ascii="Times New Roman" w:eastAsia="Times New Roman" w:hAnsi="Times New Roman" w:cs="Times New Roman"/>
+                <w:b/>
+                <w:bCs/>
+                <w:sz w:val="24"/>
+                <w:szCs w:val="24"/>
+                <w:lang w:eastAsia="es-EC"/>
+              </w:rPr>
+              <w:t>Clase</w:t>
+            </w:r>
+          </w:p>
+        </w:tc>
+      </w:tr>
+      <w:tr>
+        <w:tc>
+          <w:tcPr>
+            <w:tcW w:w="3256" w:type="dxa"/>
+          </w:tcPr>
+          <w:p>
+            <w:pPr>
+              <w:spacing w:before="100" w:beforeAutospacing="1" w:after="100" w:afterAutospacing="1"/>
+              <w:jc w:val="both"/>
+              <w:rPr>
+                <w:rFonts w:ascii="Times New Roman" w:eastAsia="Times New Roman" w:hAnsi="Times New Roman" w:cs="Times New Roman"/>
+                <w:sz w:val="24"/>
+                <w:szCs w:val="24"/>
+                <w:lang w:eastAsia="es-EC"/>
+              </w:rPr>
+            </w:pPr>
+            <w:r>
+              <w:rPr>
+                <w:rFonts w:ascii="Times New Roman" w:eastAsia="Times New Roman" w:hAnsi="Times New Roman" w:cs="Times New Roman"/>
+                <w:sz w:val="24"/>
+                <w:szCs w:val="24"/>
+                <w:lang w:eastAsia="es-EC"/>
+              </w:rPr>
+              <w:t>Product</w:t>
+            </w:r>
+          </w:p>
+        </w:tc>
+        <w:tc>
+          <w:tcPr>
+            <w:tcW w:w="5811" w:type="dxa"/>
+          </w:tcPr>
+          <w:p>
+            <w:pPr>
+              <w:spacing w:before="100" w:beforeAutospacing="1" w:after="100" w:afterAutospacing="1"/>
+              <w:jc w:val="both"/>
+              <w:rPr>
+                <w:rFonts w:ascii="Times New Roman" w:eastAsia="Times New Roman" w:hAnsi="Times New Roman" w:cs="Times New Roman"/>
+                <w:sz w:val="24"/>
+                <w:szCs w:val="24"/>
+                <w:lang w:eastAsia="es-EC"/>
+              </w:rPr>
+            </w:pPr>
+            <w:r>
+              <w:rPr>
+                <w:rFonts w:ascii="Times New Roman" w:eastAsia="Times New Roman" w:hAnsi="Times New Roman" w:cs="Times New Roman"/>
+                <w:sz w:val="24"/>
+                <w:szCs w:val="24"/>
+                <w:lang w:eastAsia="es-EC"/>
+              </w:rPr>
+              <w:t>vehiculos.producto.Vehiculo</w:t>
+            </w:r>
+          </w:p>
+        </w:tc>
+      </w:tr>
+      <w:tr>
+        <w:tc>
+          <w:tcPr>
+            <w:tcW w:w="3256" w:type="dxa"/>
+          </w:tcPr>
+          <w:p>
+            <w:pPr>
+              <w:spacing w:before="100" w:beforeAutospacing="1" w:after="100" w:afterAutospacing="1"/>
+              <w:jc w:val="both"/>
+              <w:rPr>
+                <w:rFonts w:ascii="Times New Roman" w:eastAsia="Times New Roman" w:hAnsi="Times New Roman" w:cs="Times New Roman"/>
+                <w:sz w:val="24"/>
+                <w:szCs w:val="24"/>
+                <w:lang w:eastAsia="es-EC"/>
+              </w:rPr>
+            </w:pPr>
+            <w:r>
+              <w:rPr>
+                <w:rFonts w:ascii="Times New Roman" w:eastAsia="Times New Roman" w:hAnsi="Times New Roman" w:cs="Times New Roman"/>
+                <w:sz w:val="24"/>
+                <w:szCs w:val="24"/>
+                <w:lang w:eastAsia="es-EC"/>
+              </w:rPr>
+              <w:t>ConcreteProduct</w:t>
+            </w:r>
+          </w:p>
+        </w:tc>
+        <w:tc>
+          <w:tcPr>
+            <w:tcW w:w="5811" w:type="dxa"/>
+          </w:tcPr>
+          <w:p>
+            <w:pPr>
+              <w:spacing w:before="100" w:beforeAutospacing="1" w:after="100" w:afterAutospacing="1"/>
+              <w:jc w:val="both"/>
+              <w:rPr>
+                <w:rFonts w:ascii="Times New Roman" w:eastAsia="Times New Roman" w:hAnsi="Times New Roman" w:cs="Times New Roman"/>
+                <w:sz w:val="24"/>
+                <w:szCs w:val="24"/>
+                <w:lang w:eastAsia="es-EC"/>
+              </w:rPr>
+            </w:pPr>
+            <w:r>
+              <w:rPr>
+                <w:rFonts w:ascii="Times New Roman" w:eastAsia="Times New Roman" w:hAnsi="Times New Roman" w:cs="Times New Roman"/>
+                <w:sz w:val="24"/>
+                <w:szCs w:val="24"/>
+                <w:lang w:eastAsia="es-EC"/>
+              </w:rPr>
+              <w:t>Auto, Camioneta, Camion</w:t>
+            </w:r>
+          </w:p>
+        </w:tc>
+      </w:tr>
+      <w:tr>
+        <w:tc>
+          <w:tcPr>
+            <w:tcW w:w="3256" w:type="dxa"/>
+          </w:tcPr>
+          <w:p>
+            <w:pPr>
+              <w:spacing w:before="100" w:beforeAutospacing="1" w:after="100" w:afterAutospacing="1"/>
+              <w:jc w:val="both"/>
+              <w:rPr>
+                <w:rFonts w:ascii="Times New Roman" w:eastAsia="Times New Roman" w:hAnsi="Times New Roman" w:cs="Times New Roman"/>
+                <w:sz w:val="24"/>
+                <w:szCs w:val="24"/>
+                <w:lang w:eastAsia="es-EC"/>
+              </w:rPr>
+            </w:pPr>
+            <w:r>
+              <w:rPr>
+                <w:rFonts w:ascii="Times New Roman" w:eastAsia="Times New Roman" w:hAnsi="Times New Roman" w:cs="Times New Roman"/>
+                <w:sz w:val="24"/>
+                <w:szCs w:val="24"/>
+                <w:lang w:eastAsia="es-EC"/>
+              </w:rPr>
+              <w:t>Creator</w:t>
+            </w:r>
+          </w:p>
+        </w:tc>
+        <w:tc>
+          <w:tcPr>
+            <w:tcW w:w="5811" w:type="dxa"/>
+          </w:tcPr>
+          <w:p>
+            <w:pPr>
+              <w:spacing w:before="100" w:beforeAutospacing="1" w:after="100" w:afterAutospacing="1"/>
+              <w:jc w:val="both"/>
+              <w:rPr>
+                <w:rFonts w:ascii="Times New Roman" w:eastAsia="Times New Roman" w:hAnsi="Times New Roman" w:cs="Times New Roman"/>
+                <w:sz w:val="24"/>
+                <w:szCs w:val="24"/>
+                <w:lang w:eastAsia="es-EC"/>
+              </w:rPr>
+            </w:pPr>
+            <w:r>
+              <w:rPr>
+                <w:rFonts w:ascii="Times New Roman" w:eastAsia="Times New Roman" w:hAnsi="Times New Roman" w:cs="Times New Roman"/>
+                <w:sz w:val="24"/>
+                <w:szCs w:val="24"/>
+                <w:lang w:eastAsia="es-EC"/>
+              </w:rPr>
+              <w:t>vehiculos.creador.CreadorVehiculo</w:t>
+            </w:r>
+          </w:p>
+        </w:tc>
+      </w:tr>
+      <w:tr>
+        <w:tc>
+          <w:tcPr>
+            <w:tcW w:w="3256" w:type="dxa"/>
+          </w:tcPr>
+          <w:p>
+            <w:pPr>
+              <w:spacing w:before="100" w:beforeAutospacing="1" w:after="100" w:afterAutospacing="1"/>
+              <w:jc w:val="both"/>
+              <w:rPr>
+                <w:rFonts w:ascii="Times New Roman" w:eastAsia="Times New Roman" w:hAnsi="Times New Roman" w:cs="Times New Roman"/>
+                <w:sz w:val="24"/>
+                <w:szCs w:val="24"/>
+                <w:lang w:eastAsia="es-EC"/>
+              </w:rPr>
+            </w:pPr>
+            <w:r>
+              <w:rPr>
+                <w:rFonts w:ascii="Times New Roman" w:eastAsia="Times New Roman" w:hAnsi="Times New Roman" w:cs="Times New Roman"/>
+                <w:sz w:val="24"/>
+                <w:szCs w:val="24"/>
+                <w:lang w:eastAsia="es-EC"/>
+              </w:rPr>
+              <w:t>ConcreteCreator</w:t>
+            </w:r>
+          </w:p>
+        </w:tc>
+        <w:tc>
+          <w:tcPr>
+            <w:tcW w:w="5811" w:type="dxa"/>
+          </w:tcPr>
+          <w:p>
+            <w:pPr>
+              <w:spacing w:before="100" w:beforeAutospacing="1" w:after="100" w:afterAutospacing="1"/>
+              <w:jc w:val="both"/>
+              <w:rPr>
+                <w:rFonts w:ascii="Times New Roman" w:eastAsia="Times New Roman" w:hAnsi="Times New Roman" w:cs="Times New Roman"/>
+                <w:sz w:val="24"/>
+                <w:szCs w:val="24"/>
+                <w:lang w:eastAsia="es-EC"/>
+              </w:rPr>
+            </w:pPr>
+            <w:r>
+              <w:rPr>
+                <w:rFonts w:ascii="Times New Roman" w:eastAsia="Times New Roman" w:hAnsi="Times New Roman" w:cs="Times New Roman"/>
+                <w:sz w:val="24"/>
+                <w:szCs w:val="24"/>
+                <w:lang w:eastAsia="es-EC"/>
+              </w:rPr>
+              <w:t>CreadorAuto, CreadorCamioneta, CreadorCamion</w:t>
+            </w:r>
+          </w:p>
+        </w:tc>
+      </w:tr>
+      <w:tr>
+        <w:tc>
+          <w:tcPr>
+            <w:tcW w:w="3256" w:type="dxa"/>
+          </w:tcPr>
+          <w:p>
+            <w:pPr>
+              <w:spacing w:before="100" w:beforeAutospacing="1" w:after="100" w:afterAutospacing="1"/>
+              <w:jc w:val="both"/>
+              <w:rPr>
+                <w:rFonts w:ascii="Times New Roman" w:eastAsia="Times New Roman" w:hAnsi="Times New Roman" w:cs="Times New Roman"/>
+                <w:sz w:val="24"/>
+                <w:szCs w:val="24"/>
+                <w:lang w:eastAsia="es-EC"/>
+              </w:rPr>
+            </w:pPr>
+            <w:r>
+              <w:rPr>
+                <w:rFonts w:ascii="Times New Roman" w:eastAsia="Times New Roman" w:hAnsi="Times New Roman" w:cs="Times New Roman"/>
+                <w:sz w:val="24"/>
+                <w:szCs w:val="24"/>
+                <w:lang w:eastAsia="es-EC"/>
+              </w:rPr>
+              <w:t>Cliente</w:t>
+            </w:r>
+          </w:p>
+        </w:tc>
+        <w:tc>
+          <w:tcPr>
+            <w:tcW w:w="5811" w:type="dxa"/>
+          </w:tcPr>
+          <w:p>
+            <w:pPr>
+              <w:spacing w:before="100" w:beforeAutospacing="1" w:after="100" w:afterAutospacing="1"/>
+              <w:jc w:val="both"/>
+              <w:rPr>
+                <w:rFonts w:ascii="Times New Roman" w:eastAsia="Times New Roman" w:hAnsi="Times New Roman" w:cs="Times New Roman"/>
+                <w:sz w:val="24"/>
+                <w:szCs w:val="24"/>
+                <w:lang w:eastAsia="es-EC"/>
+              </w:rPr>
+            </w:pPr>
+            <w:r>
+              <w:rPr>
+                <w:rFonts w:ascii="Times New Roman" w:eastAsia="Times New Roman" w:hAnsi="Times New Roman" w:cs="Times New Roman"/>
+                <w:sz w:val="24"/>
+                <w:szCs w:val="24"/>
+                <w:lang w:eastAsia="es-EC"/>
+              </w:rPr>
+              <w:t>vehiculos.Main</w:t>
+            </w:r>
+          </w:p>
+        </w:tc>
+      </w:tr>
+    </w:tbl>
+    <w:p>
+      <w:pPr>
+        <w:jc w:val="both"/>
+        <w:rPr>
+          <w:rFonts w:ascii="Times New Roman" w:eastAsia="Times New Roman" w:hAnsi="Times New Roman" w:cs="Times New Roman"/>
+          <w:sz w:val="24"/>
+          <w:szCs w:val="24"/>
+          <w:lang w:eastAsia="es-EC"/>
+        </w:rPr>
+      </w:pPr>
+    </w:p>
+    <w:p>
+      <w:pPr>
+        <w:pStyle w:val="Prrafodelista"/>
+        <w:numPr>
+          <w:ilvl w:val="0"/>
+          <w:numId w:val="2"/>
+        </w:numPr>
+        <w:jc w:val="both"/>
+        <w:rPr>
+          <w:rFonts w:ascii="Times New Roman" w:eastAsia="Times New Roman" w:hAnsi="Times New Roman" w:cs="Times New Roman"/>
+          <w:sz w:val="24"/>
+          <w:szCs w:val="24"/>
+        </w:rPr>
+      </w:pPr>
+      <w:r>
+        <w:rPr>
+          <w:rFonts w:ascii="Times New Roman" w:eastAsia="Times New Roman" w:hAnsi="Times New Roman" w:cs="Times New Roman"/>
+          <w:sz w:val="24"/>
+          <w:szCs w:val="24"/>
+        </w:rPr>
+        <w:t>Uso crítico de inteligencia artificial</w:t>
+      </w:r>
+    </w:p>
+    <w:p>
+      <w:pPr>
         <w:jc w:val="both"/>
         <w:rPr>
           <w:rFonts w:ascii="Times New Roman" w:hAnsi="Times New Roman" w:cs="Times New Roman"/>
@@ -1667,7 +2175,7 @@
         </w:rPr>
         <w:t xml:space="preserve">Link del análisis: </w:t>
       </w:r>
-      <w:hyperlink r:id="rId6" w:history="1">
+      <w:hyperlink r:id="rId8" w:history="1">
         <w:r>
           <w:rPr>
             <w:rStyle w:val="Hipervnculo"/>
@@ -1763,7 +2271,6 @@
           <w:szCs w:val="24"/>
           <w:lang w:eastAsia="es-EC"/>
         </w:rPr>
-        <w:lastRenderedPageBreak/>
         <w:t xml:space="preserve">Estoy desarrollando una actividad académica sobre patrones creacionales. Para el primer escenario he seleccionado el patrón </w:t>
       </w:r>
       <w:r>
@@ -2109,6 +2616,7 @@
           <w:szCs w:val="24"/>
           <w:lang w:eastAsia="es-EC"/>
         </w:rPr>
+        <w:lastRenderedPageBreak/>
         <w:t>Explica las relaciones que deben existir entre las clases y el tipo de relación UML que corresponde.</w:t>
       </w:r>
     </w:p>
@@ -2503,13 +3011,51 @@
         <w:jc w:val="both"/>
         <w:rPr>
           <w:rFonts w:ascii="Times New Roman" w:hAnsi="Times New Roman" w:cs="Times New Roman"/>
+          <w:sz w:val="24"/>
+          <w:szCs w:val="24"/>
+        </w:rPr>
+      </w:pPr>
+    </w:p>
+    <w:p>
+      <w:pPr>
+        <w:jc w:val="both"/>
+        <w:rPr>
+          <w:rFonts w:ascii="Times New Roman" w:hAnsi="Times New Roman" w:cs="Times New Roman"/>
+          <w:sz w:val="24"/>
+          <w:szCs w:val="24"/>
+        </w:rPr>
+      </w:pPr>
+    </w:p>
+    <w:p>
+      <w:pPr>
+        <w:jc w:val="both"/>
+        <w:rPr>
+          <w:rFonts w:ascii="Times New Roman" w:hAnsi="Times New Roman" w:cs="Times New Roman"/>
+          <w:sz w:val="24"/>
+          <w:szCs w:val="24"/>
+        </w:rPr>
+      </w:pPr>
+    </w:p>
+    <w:p>
+      <w:pPr>
+        <w:jc w:val="both"/>
+        <w:rPr>
+          <w:rFonts w:ascii="Times New Roman" w:hAnsi="Times New Roman" w:cs="Times New Roman"/>
+          <w:sz w:val="24"/>
+          <w:szCs w:val="24"/>
+          <w:u w:val="single"/>
+        </w:rPr>
+      </w:pPr>
+      <w:r>
+        <w:rPr>
+          <w:rFonts w:ascii="Times New Roman" w:hAnsi="Times New Roman" w:cs="Times New Roman"/>
           <w:b/>
           <w:bCs/>
           <w:sz w:val="24"/>
           <w:szCs w:val="24"/>
-          <w:u w:val="single"/>
-        </w:rPr>
-      </w:pPr>
+        </w:rPr>
+        <w:t xml:space="preserve">RECOMENDACIONES </w:t>
+      </w:r>
       <w:r>
         <w:rPr>
           <w:rFonts w:ascii="Times New Roman" w:hAnsi="Times New Roman" w:cs="Times New Roman"/>
@@ -2517,9 +3063,8 @@
           <w:bCs/>
           <w:sz w:val="24"/>
           <w:szCs w:val="24"/>
-          <w:u w:val="single"/>
-        </w:rPr>
-        <w:t xml:space="preserve">Escenario </w:t>
+        </w:rPr>
+        <w:t>DE</w:t>
       </w:r>
       <w:r>
         <w:rPr>
@@ -2528,20 +3073,802 @@
           <w:bCs/>
           <w:sz w:val="24"/>
           <w:szCs w:val="24"/>
-          <w:u w:val="single"/>
-        </w:rPr>
-        <w:t>2</w:t>
-      </w:r>
-      <w:r>
-        <w:rPr>
-          <w:rFonts w:ascii="Times New Roman" w:hAnsi="Times New Roman" w:cs="Times New Roman"/>
+        </w:rPr>
+        <w:t xml:space="preserve"> LA IA</w:t>
+      </w:r>
+    </w:p>
+    <w:tbl>
+      <w:tblPr>
+        <w:tblStyle w:val="Tablaconcuadrcula"/>
+        <w:tblW w:w="0" w:type="auto"/>
+        <w:tblLook w:val="04A0" w:firstRow="1" w:lastRow="0" w:firstColumn="1" w:lastColumn="0" w:noHBand="0" w:noVBand="1"/>
+      </w:tblPr>
+      <w:tblGrid>
+        <w:gridCol w:w="2342"/>
+        <w:gridCol w:w="6674"/>
+      </w:tblGrid>
+      <w:tr>
+        <w:tc>
+          <w:tcPr>
+            <w:tcW w:w="0" w:type="auto"/>
+            <w:hideMark/>
+          </w:tcPr>
+          <w:p>
+            <w:pPr>
+              <w:spacing w:before="100" w:beforeAutospacing="1" w:after="100" w:afterAutospacing="1"/>
+              <w:jc w:val="center"/>
+              <w:rPr>
+                <w:rFonts w:ascii="Times New Roman" w:eastAsia="Times New Roman" w:hAnsi="Times New Roman" w:cs="Times New Roman"/>
+                <w:b/>
+                <w:bCs/>
+                <w:sz w:val="24"/>
+                <w:szCs w:val="24"/>
+                <w:lang w:eastAsia="es-EC"/>
+              </w:rPr>
+            </w:pPr>
+            <w:r>
+              <w:rPr>
+                <w:rFonts w:ascii="Times New Roman" w:eastAsia="Times New Roman" w:hAnsi="Times New Roman" w:cs="Times New Roman"/>
+                <w:b/>
+                <w:bCs/>
+                <w:sz w:val="24"/>
+                <w:szCs w:val="24"/>
+                <w:lang w:eastAsia="es-EC"/>
+              </w:rPr>
+              <w:t>Apartado</w:t>
+            </w:r>
+          </w:p>
+        </w:tc>
+        <w:tc>
+          <w:tcPr>
+            <w:tcW w:w="0" w:type="auto"/>
+            <w:hideMark/>
+          </w:tcPr>
+          <w:p>
+            <w:pPr>
+              <w:spacing w:before="100" w:beforeAutospacing="1" w:after="100" w:afterAutospacing="1"/>
+              <w:jc w:val="center"/>
+              <w:rPr>
+                <w:rFonts w:ascii="Times New Roman" w:eastAsia="Times New Roman" w:hAnsi="Times New Roman" w:cs="Times New Roman"/>
+                <w:b/>
+                <w:bCs/>
+                <w:sz w:val="24"/>
+                <w:szCs w:val="24"/>
+                <w:lang w:eastAsia="es-EC"/>
+              </w:rPr>
+            </w:pPr>
+            <w:r>
+              <w:rPr>
+                <w:rFonts w:ascii="Times New Roman" w:eastAsia="Times New Roman" w:hAnsi="Times New Roman" w:cs="Times New Roman"/>
+                <w:b/>
+                <w:bCs/>
+                <w:sz w:val="24"/>
+                <w:szCs w:val="24"/>
+                <w:lang w:eastAsia="es-EC"/>
+              </w:rPr>
+              <w:t>Decisión</w:t>
+            </w:r>
+          </w:p>
+        </w:tc>
+      </w:tr>
+      <w:tr>
+        <w:tc>
+          <w:tcPr>
+            <w:tcW w:w="0" w:type="auto"/>
+            <w:hideMark/>
+          </w:tcPr>
+          <w:p>
+            <w:pPr>
+              <w:spacing w:before="100" w:beforeAutospacing="1" w:after="100" w:afterAutospacing="1"/>
+              <w:rPr>
+                <w:rFonts w:ascii="Times New Roman" w:eastAsia="Times New Roman" w:hAnsi="Times New Roman" w:cs="Times New Roman"/>
+                <w:sz w:val="24"/>
+                <w:szCs w:val="24"/>
+                <w:lang w:eastAsia="es-EC"/>
+              </w:rPr>
+            </w:pPr>
+            <w:r>
+              <w:rPr>
+                <w:rFonts w:ascii="Times New Roman" w:eastAsia="Times New Roman" w:hAnsi="Times New Roman" w:cs="Times New Roman"/>
+                <w:sz w:val="24"/>
+                <w:szCs w:val="24"/>
+                <w:lang w:eastAsia="es-EC"/>
+              </w:rPr>
+              <w:t>Recomendación aceptada</w:t>
+            </w:r>
+          </w:p>
+        </w:tc>
+        <w:tc>
+          <w:tcPr>
+            <w:tcW w:w="0" w:type="auto"/>
+            <w:hideMark/>
+          </w:tcPr>
+          <w:p>
+            <w:pPr>
+              <w:spacing w:before="100" w:beforeAutospacing="1" w:after="100" w:afterAutospacing="1"/>
+              <w:rPr>
+                <w:rFonts w:ascii="Times New Roman" w:eastAsia="Times New Roman" w:hAnsi="Times New Roman" w:cs="Times New Roman"/>
+                <w:sz w:val="24"/>
+                <w:szCs w:val="24"/>
+                <w:lang w:eastAsia="es-EC"/>
+              </w:rPr>
+            </w:pPr>
+            <w:r>
+              <w:rPr>
+                <w:rFonts w:ascii="Times New Roman" w:eastAsia="Times New Roman" w:hAnsi="Times New Roman" w:cs="Times New Roman"/>
+                <w:sz w:val="24"/>
+                <w:szCs w:val="24"/>
+                <w:lang w:eastAsia="es-EC"/>
+              </w:rPr>
+              <w:t>Utilizar Vehículo como clase abstracta. Recomendado mediante la IA y también propuesta dentro del análisis inicial.</w:t>
+            </w:r>
+          </w:p>
+        </w:tc>
+      </w:tr>
+      <w:tr>
+        <w:tc>
+          <w:tcPr>
+            <w:tcW w:w="0" w:type="auto"/>
+            <w:hideMark/>
+          </w:tcPr>
+          <w:p>
+            <w:pPr>
+              <w:spacing w:before="100" w:beforeAutospacing="1" w:after="100" w:afterAutospacing="1"/>
+              <w:rPr>
+                <w:rFonts w:ascii="Times New Roman" w:eastAsia="Times New Roman" w:hAnsi="Times New Roman" w:cs="Times New Roman"/>
+                <w:sz w:val="24"/>
+                <w:szCs w:val="24"/>
+                <w:lang w:eastAsia="es-EC"/>
+              </w:rPr>
+            </w:pPr>
+            <w:r>
+              <w:rPr>
+                <w:rFonts w:ascii="Times New Roman" w:eastAsia="Times New Roman" w:hAnsi="Times New Roman" w:cs="Times New Roman"/>
+                <w:sz w:val="24"/>
+                <w:szCs w:val="24"/>
+                <w:lang w:eastAsia="es-EC"/>
+              </w:rPr>
+              <w:t>Recomendación modificada</w:t>
+            </w:r>
+          </w:p>
+        </w:tc>
+        <w:tc>
+          <w:tcPr>
+            <w:tcW w:w="0" w:type="auto"/>
+            <w:hideMark/>
+          </w:tcPr>
+          <w:p>
+            <w:pPr>
+              <w:spacing w:before="100" w:beforeAutospacing="1" w:after="100" w:afterAutospacing="1"/>
+              <w:rPr>
+                <w:rFonts w:ascii="Times New Roman" w:eastAsia="Times New Roman" w:hAnsi="Times New Roman" w:cs="Times New Roman"/>
+                <w:sz w:val="24"/>
+                <w:szCs w:val="24"/>
+                <w:lang w:eastAsia="es-EC"/>
+              </w:rPr>
+            </w:pPr>
+            <w:r>
+              <w:rPr>
+                <w:rFonts w:ascii="Times New Roman" w:eastAsia="Times New Roman" w:hAnsi="Times New Roman" w:cs="Times New Roman"/>
+                <w:sz w:val="24"/>
+                <w:szCs w:val="24"/>
+                <w:lang w:eastAsia="es-EC"/>
+              </w:rPr>
+              <w:t xml:space="preserve">Cambiar el método de </w:t>
+            </w:r>
+            <w:proofErr w:type="spellStart"/>
+            <w:r>
+              <w:rPr>
+                <w:rFonts w:ascii="Times New Roman" w:eastAsia="Times New Roman" w:hAnsi="Times New Roman" w:cs="Times New Roman"/>
+                <w:sz w:val="24"/>
+                <w:szCs w:val="24"/>
+                <w:lang w:eastAsia="es-EC"/>
+              </w:rPr>
+              <w:t>crearVehiculo</w:t>
+            </w:r>
+            <w:proofErr w:type="spellEnd"/>
+            <w:r>
+              <w:rPr>
+                <w:rFonts w:ascii="Times New Roman" w:eastAsia="Times New Roman" w:hAnsi="Times New Roman" w:cs="Times New Roman"/>
+                <w:sz w:val="24"/>
+                <w:szCs w:val="24"/>
+                <w:lang w:eastAsia="es-EC"/>
+              </w:rPr>
+              <w:t>() para recibir los atributos comunes.</w:t>
+            </w:r>
+          </w:p>
+        </w:tc>
+      </w:tr>
+    </w:tbl>
+    <w:p>
+      <w:pPr>
+        <w:jc w:val="both"/>
+        <w:rPr>
+          <w:rFonts w:ascii="Times New Roman" w:hAnsi="Times New Roman" w:cs="Times New Roman"/>
+          <w:sz w:val="24"/>
+          <w:szCs w:val="24"/>
+        </w:rPr>
+      </w:pPr>
+    </w:p>
+    <w:p>
+      <w:pPr>
+        <w:spacing w:before="100" w:beforeAutospacing="1" w:after="100" w:afterAutospacing="1" w:line="240" w:lineRule="auto"/>
+        <w:jc w:val="both"/>
+        <w:rPr>
+          <w:rFonts w:ascii="Times New Roman" w:eastAsia="Times New Roman" w:hAnsi="Times New Roman" w:cs="Times New Roman"/>
+          <w:sz w:val="24"/>
+          <w:szCs w:val="24"/>
+          <w:lang w:eastAsia="es-EC"/>
+        </w:rPr>
+      </w:pPr>
+      <w:r>
+        <w:rPr>
+          <w:rFonts w:ascii="Times New Roman" w:eastAsia="Times New Roman" w:hAnsi="Times New Roman" w:cs="Times New Roman"/>
+          <w:sz w:val="24"/>
+          <w:szCs w:val="24"/>
+          <w:lang w:eastAsia="es-EC"/>
+        </w:rPr>
+        <w:t>Se acepta que Vehiculo sea una clase abstracta porque todos los vehículos comparten placa, marca, modelo, año de fabricación y avalúo, y cada tipo debe implementar su propia lógica de calcularMatricula() bajo un contrato común; así la lógica principal trab</w:t>
+      </w:r>
+      <w:r>
+        <w:rPr>
+          <w:rFonts w:ascii="Times New Roman" w:eastAsia="Times New Roman" w:hAnsi="Times New Roman" w:cs="Times New Roman"/>
+          <w:sz w:val="24"/>
+          <w:szCs w:val="24"/>
+          <w:lang w:eastAsia="es-EC"/>
+        </w:rPr>
+        <w:t>aja con Vehiculo sin depender de Auto, Camioneta o Camión. Además, coincidía con lo planteado en el análisis inicial.</w:t>
+      </w:r>
+    </w:p>
+    <w:p>
+      <w:pPr>
+        <w:pStyle w:val="NormalWeb"/>
+        <w:jc w:val="both"/>
+      </w:pPr>
+      <w:r>
+        <w:t xml:space="preserve">Mediante la explicación de la IA, el diagrama, las clases inferidas y las relaciones del Factory </w:t>
+      </w:r>
+      <w:proofErr w:type="spellStart"/>
+      <w:r>
+        <w:t>Method</w:t>
+      </w:r>
+      <w:proofErr w:type="spellEnd"/>
+      <w:r>
+        <w:t xml:space="preserve"> fueron correctas. En cuanto a la modificación en el método </w:t>
+      </w:r>
+      <w:proofErr w:type="spellStart"/>
+      <w:r>
+        <w:t>crearVehiculo</w:t>
+      </w:r>
+      <w:proofErr w:type="spellEnd"/>
+      <w:r>
+        <w:t>()</w:t>
+      </w:r>
+      <w:r>
+        <w:t xml:space="preserve"> es debido a que consideramos necesario que este método reciba los atributos comunes, como placa, </w:t>
+      </w:r>
+      <w:r>
+        <w:lastRenderedPageBreak/>
+        <w:t xml:space="preserve">marca, modelo, año de fabricación y avalúo, para que cada vehículo pueda crearse con su información correspondiente, la modificación facilita el registro de los vehículos y mantiene la estructura del patrón Factory </w:t>
+      </w:r>
+      <w:proofErr w:type="spellStart"/>
+      <w:r>
+        <w:t>Method</w:t>
+      </w:r>
+      <w:proofErr w:type="spellEnd"/>
+      <w:r>
+        <w:t>.</w:t>
+      </w:r>
+    </w:p>
+    <w:p>
+      <w:pPr>
+        <w:jc w:val="both"/>
+        <w:rPr>
+          <w:rFonts w:ascii="Times New Roman" w:eastAsia="Times New Roman" w:hAnsi="Times New Roman" w:cs="Times New Roman"/>
+          <w:sz w:val="24"/>
+          <w:szCs w:val="24"/>
+          <w:lang w:eastAsia="es-EC"/>
+        </w:rPr>
+      </w:pPr>
+    </w:p>
+    <w:p>
+      <w:pPr>
+        <w:jc w:val="both"/>
+        <w:rPr>
+          <w:rFonts w:ascii="Times New Roman" w:eastAsia="Times New Roman" w:hAnsi="Times New Roman" w:cs="Times New Roman"/>
           <w:b/>
           <w:bCs/>
           <w:sz w:val="24"/>
           <w:szCs w:val="24"/>
+          <w:lang w:eastAsia="es-EC"/>
+        </w:rPr>
+      </w:pPr>
+      <w:r>
+        <w:rPr>
+          <w:rFonts w:ascii="Times New Roman" w:eastAsia="Times New Roman" w:hAnsi="Times New Roman" w:cs="Times New Roman"/>
+          <w:b/>
+          <w:bCs/>
+          <w:sz w:val="24"/>
+          <w:szCs w:val="24"/>
+          <w:lang w:eastAsia="es-EC"/>
+        </w:rPr>
+        <w:t>Ajustes realizados durante la implementación (Escenario 1):</w:t>
+      </w:r>
+    </w:p>
+    <w:tbl>
+      <w:tblPr>
+        <w:tblStyle w:val="Tablaconcuadrcula"/>
+        <w:tblW w:w="9067" w:type="dxa"/>
+        <w:tblLook w:val="04A0" w:firstRow="1" w:lastRow="0" w:firstColumn="1" w:lastColumn="0" w:noHBand="0" w:noVBand="1"/>
+      </w:tblPr>
+      <w:tblGrid>
+        <w:gridCol w:w="3900"/>
+        <w:gridCol w:w="5167"/>
+      </w:tblGrid>
+      <w:tr>
+        <w:tc>
+          <w:tcPr>
+            <w:tcW w:w="3900" w:type="dxa"/>
+          </w:tcPr>
+          <w:p>
+            <w:pPr>
+              <w:spacing w:before="100" w:beforeAutospacing="1" w:after="100" w:afterAutospacing="1"/>
+              <w:jc w:val="both"/>
+              <w:rPr>
+                <w:rFonts w:ascii="Times New Roman" w:eastAsia="Times New Roman" w:hAnsi="Times New Roman" w:cs="Times New Roman"/>
+                <w:b/>
+                <w:bCs/>
+                <w:sz w:val="24"/>
+                <w:szCs w:val="24"/>
+                <w:lang w:eastAsia="es-EC"/>
+              </w:rPr>
+            </w:pPr>
+            <w:r>
+              <w:rPr>
+                <w:rFonts w:ascii="Times New Roman" w:eastAsia="Times New Roman" w:hAnsi="Times New Roman" w:cs="Times New Roman"/>
+                <w:b/>
+                <w:bCs/>
+                <w:sz w:val="24"/>
+                <w:szCs w:val="24"/>
+                <w:lang w:eastAsia="es-EC"/>
+              </w:rPr>
+              <w:t>Cambio</w:t>
+            </w:r>
+          </w:p>
+        </w:tc>
+        <w:tc>
+          <w:tcPr>
+            <w:tcW w:w="5167" w:type="dxa"/>
+          </w:tcPr>
+          <w:p>
+            <w:pPr>
+              <w:spacing w:before="100" w:beforeAutospacing="1" w:after="100" w:afterAutospacing="1"/>
+              <w:jc w:val="both"/>
+              <w:rPr>
+                <w:rFonts w:ascii="Times New Roman" w:eastAsia="Times New Roman" w:hAnsi="Times New Roman" w:cs="Times New Roman"/>
+                <w:b/>
+                <w:bCs/>
+                <w:sz w:val="24"/>
+                <w:szCs w:val="24"/>
+                <w:lang w:eastAsia="es-EC"/>
+              </w:rPr>
+            </w:pPr>
+            <w:r>
+              <w:rPr>
+                <w:rFonts w:ascii="Times New Roman" w:eastAsia="Times New Roman" w:hAnsi="Times New Roman" w:cs="Times New Roman"/>
+                <w:b/>
+                <w:bCs/>
+                <w:sz w:val="24"/>
+                <w:szCs w:val="24"/>
+                <w:lang w:eastAsia="es-EC"/>
+              </w:rPr>
+              <w:t>Justificación</w:t>
+            </w:r>
+          </w:p>
+        </w:tc>
+      </w:tr>
+      <w:tr>
+        <w:tc>
+          <w:tcPr>
+            <w:tcW w:w="3900" w:type="dxa"/>
+          </w:tcPr>
+          <w:p>
+            <w:pPr>
+              <w:spacing w:before="100" w:beforeAutospacing="1" w:after="100" w:afterAutospacing="1"/>
+              <w:jc w:val="both"/>
+              <w:rPr>
+                <w:rFonts w:ascii="Times New Roman" w:eastAsia="Times New Roman" w:hAnsi="Times New Roman" w:cs="Times New Roman"/>
+                <w:sz w:val="24"/>
+                <w:szCs w:val="24"/>
+                <w:lang w:eastAsia="es-EC"/>
+              </w:rPr>
+            </w:pPr>
+            <w:r>
+              <w:rPr>
+                <w:rFonts w:ascii="Times New Roman" w:eastAsia="Times New Roman" w:hAnsi="Times New Roman" w:cs="Times New Roman"/>
+                <w:sz w:val="24"/>
+                <w:szCs w:val="24"/>
+                <w:lang w:eastAsia="es-EC"/>
+              </w:rPr>
+              <w:t>Se agregaron validarNoNegativo() y antiguedad() co</w:t>
+            </w:r>
+            <w:r>
+              <w:rPr>
+                <w:rFonts w:ascii="Times New Roman" w:eastAsia="Times New Roman" w:hAnsi="Times New Roman" w:cs="Times New Roman"/>
+                <w:sz w:val="24"/>
+                <w:szCs w:val="24"/>
+                <w:lang w:eastAsia="es-EC"/>
+              </w:rPr>
+              <w:t>mo métodos protegidos en Vehiculo.</w:t>
+            </w:r>
+          </w:p>
+        </w:tc>
+        <w:tc>
+          <w:tcPr>
+            <w:tcW w:w="5167" w:type="dxa"/>
+          </w:tcPr>
+          <w:p>
+            <w:pPr>
+              <w:spacing w:before="100" w:beforeAutospacing="1" w:after="100" w:afterAutospacing="1"/>
+              <w:jc w:val="both"/>
+              <w:rPr>
+                <w:rFonts w:ascii="Times New Roman" w:eastAsia="Times New Roman" w:hAnsi="Times New Roman" w:cs="Times New Roman"/>
+                <w:sz w:val="24"/>
+                <w:szCs w:val="24"/>
+                <w:lang w:eastAsia="es-EC"/>
+              </w:rPr>
+            </w:pPr>
+            <w:r>
+              <w:rPr>
+                <w:rFonts w:ascii="Times New Roman" w:eastAsia="Times New Roman" w:hAnsi="Times New Roman" w:cs="Times New Roman"/>
+                <w:sz w:val="24"/>
+                <w:szCs w:val="24"/>
+                <w:lang w:eastAsia="es-EC"/>
+              </w:rPr>
+              <w:t>Evitan repetir validaciones y el cálculo de antigüedad en cada subclase. No alteran el contrato público del diagrama.</w:t>
+            </w:r>
+          </w:p>
+        </w:tc>
+      </w:tr>
+      <w:tr>
+        <w:tc>
+          <w:tcPr>
+            <w:tcW w:w="3900" w:type="dxa"/>
+          </w:tcPr>
+          <w:p>
+            <w:pPr>
+              <w:spacing w:before="100" w:beforeAutospacing="1" w:after="100" w:afterAutospacing="1"/>
+              <w:jc w:val="both"/>
+              <w:rPr>
+                <w:rFonts w:ascii="Times New Roman" w:eastAsia="Times New Roman" w:hAnsi="Times New Roman" w:cs="Times New Roman"/>
+                <w:sz w:val="24"/>
+                <w:szCs w:val="24"/>
+                <w:lang w:eastAsia="es-EC"/>
+              </w:rPr>
+            </w:pPr>
+            <w:r>
+              <w:rPr>
+                <w:rFonts w:ascii="Times New Roman" w:eastAsia="Times New Roman" w:hAnsi="Times New Roman" w:cs="Times New Roman"/>
+                <w:sz w:val="24"/>
+                <w:szCs w:val="24"/>
+                <w:lang w:eastAsia="es-EC"/>
+              </w:rPr>
+              <w:t>Se agregaron validaciones en los constructores (placa obligatoria, año de fabricación ≥ 1900, valores no negativos).</w:t>
+            </w:r>
+          </w:p>
+        </w:tc>
+        <w:tc>
+          <w:tcPr>
+            <w:tcW w:w="5167" w:type="dxa"/>
+          </w:tcPr>
+          <w:p>
+            <w:pPr>
+              <w:spacing w:before="100" w:beforeAutospacing="1" w:after="100" w:afterAutospacing="1"/>
+              <w:jc w:val="both"/>
+              <w:rPr>
+                <w:rFonts w:ascii="Times New Roman" w:eastAsia="Times New Roman" w:hAnsi="Times New Roman" w:cs="Times New Roman"/>
+                <w:sz w:val="24"/>
+                <w:szCs w:val="24"/>
+                <w:lang w:eastAsia="es-EC"/>
+              </w:rPr>
+            </w:pPr>
+            <w:r>
+              <w:rPr>
+                <w:rFonts w:ascii="Times New Roman" w:eastAsia="Times New Roman" w:hAnsi="Times New Roman" w:cs="Times New Roman"/>
+                <w:sz w:val="24"/>
+                <w:szCs w:val="24"/>
+                <w:lang w:eastAsia="es-EC"/>
+              </w:rPr>
+              <w:t>El enunciado exige a</w:t>
+            </w:r>
+            <w:r>
+              <w:rPr>
+                <w:rFonts w:ascii="Times New Roman" w:eastAsia="Times New Roman" w:hAnsi="Times New Roman" w:cs="Times New Roman"/>
+                <w:sz w:val="24"/>
+                <w:szCs w:val="24"/>
+                <w:lang w:eastAsia="es-EC"/>
+              </w:rPr>
+              <w:t>tributos válidos para calcular la matrícula; así no se crean vehículos inconsistentes.</w:t>
+            </w:r>
+          </w:p>
+        </w:tc>
+      </w:tr>
+      <w:tr>
+        <w:tc>
+          <w:tcPr>
+            <w:tcW w:w="3900" w:type="dxa"/>
+          </w:tcPr>
+          <w:p>
+            <w:pPr>
+              <w:spacing w:before="100" w:beforeAutospacing="1" w:after="100" w:afterAutospacing="1"/>
+              <w:jc w:val="both"/>
+              <w:rPr>
+                <w:rFonts w:ascii="Times New Roman" w:eastAsia="Times New Roman" w:hAnsi="Times New Roman" w:cs="Times New Roman"/>
+                <w:sz w:val="24"/>
+                <w:szCs w:val="24"/>
+                <w:lang w:eastAsia="es-EC"/>
+              </w:rPr>
+            </w:pPr>
+            <w:r>
+              <w:rPr>
+                <w:rFonts w:ascii="Times New Roman" w:eastAsia="Times New Roman" w:hAnsi="Times New Roman" w:cs="Times New Roman"/>
+                <w:sz w:val="24"/>
+                <w:szCs w:val="24"/>
+                <w:lang w:eastAsia="es-EC"/>
+              </w:rPr>
+              <w:t>Los atributos capacidad, uso y tonelaje se declararon final.</w:t>
+            </w:r>
+          </w:p>
+        </w:tc>
+        <w:tc>
+          <w:tcPr>
+            <w:tcW w:w="5167" w:type="dxa"/>
+          </w:tcPr>
+          <w:p>
+            <w:pPr>
+              <w:spacing w:before="100" w:beforeAutospacing="1" w:after="100" w:afterAutospacing="1"/>
+              <w:jc w:val="both"/>
+              <w:rPr>
+                <w:rFonts w:ascii="Times New Roman" w:eastAsia="Times New Roman" w:hAnsi="Times New Roman" w:cs="Times New Roman"/>
+                <w:sz w:val="24"/>
+                <w:szCs w:val="24"/>
+                <w:lang w:eastAsia="es-EC"/>
+              </w:rPr>
+            </w:pPr>
+            <w:r>
+              <w:rPr>
+                <w:rFonts w:ascii="Times New Roman" w:eastAsia="Times New Roman" w:hAnsi="Times New Roman" w:cs="Times New Roman"/>
+                <w:sz w:val="24"/>
+                <w:szCs w:val="24"/>
+                <w:lang w:eastAsia="es-EC"/>
+              </w:rPr>
+              <w:t>Un vehículo no debe cambiar sus datos tras su creación.</w:t>
+            </w:r>
+          </w:p>
+        </w:tc>
+      </w:tr>
+      <w:tr>
+        <w:tc>
+          <w:tcPr>
+            <w:tcW w:w="3900" w:type="dxa"/>
+          </w:tcPr>
+          <w:p>
+            <w:pPr>
+              <w:spacing w:before="100" w:beforeAutospacing="1" w:after="100" w:afterAutospacing="1"/>
+              <w:jc w:val="both"/>
+              <w:rPr>
+                <w:rFonts w:ascii="Times New Roman" w:eastAsia="Times New Roman" w:hAnsi="Times New Roman" w:cs="Times New Roman"/>
+                <w:sz w:val="24"/>
+                <w:szCs w:val="24"/>
+                <w:lang w:eastAsia="es-EC"/>
+              </w:rPr>
+            </w:pPr>
+            <w:r>
+              <w:rPr>
+                <w:rFonts w:ascii="Times New Roman" w:eastAsia="Times New Roman" w:hAnsi="Times New Roman" w:cs="Times New Roman"/>
+                <w:sz w:val="24"/>
+                <w:szCs w:val="24"/>
+                <w:lang w:eastAsia="es-EC"/>
+              </w:rPr>
+              <w:t>Se agregaron getters y toString().</w:t>
+            </w:r>
+          </w:p>
+        </w:tc>
+        <w:tc>
+          <w:tcPr>
+            <w:tcW w:w="5167" w:type="dxa"/>
+          </w:tcPr>
+          <w:p>
+            <w:pPr>
+              <w:spacing w:before="100" w:beforeAutospacing="1" w:after="100" w:afterAutospacing="1"/>
+              <w:jc w:val="both"/>
+              <w:rPr>
+                <w:rFonts w:ascii="Times New Roman" w:eastAsia="Times New Roman" w:hAnsi="Times New Roman" w:cs="Times New Roman"/>
+                <w:sz w:val="24"/>
+                <w:szCs w:val="24"/>
+                <w:lang w:eastAsia="es-EC"/>
+              </w:rPr>
+            </w:pPr>
+            <w:r>
+              <w:rPr>
+                <w:rFonts w:ascii="Times New Roman" w:eastAsia="Times New Roman" w:hAnsi="Times New Roman" w:cs="Times New Roman"/>
+                <w:sz w:val="24"/>
+                <w:szCs w:val="24"/>
+                <w:lang w:eastAsia="es-EC"/>
+              </w:rPr>
+              <w:t>Permiten mostra</w:t>
+            </w:r>
+            <w:r>
+              <w:rPr>
+                <w:rFonts w:ascii="Times New Roman" w:eastAsia="Times New Roman" w:hAnsi="Times New Roman" w:cs="Times New Roman"/>
+                <w:sz w:val="24"/>
+                <w:szCs w:val="24"/>
+                <w:lang w:eastAsia="es-EC"/>
+              </w:rPr>
+              <w:t>r el vehículo creado en la consola.</w:t>
+            </w:r>
+          </w:p>
+        </w:tc>
+      </w:tr>
+      <w:tr>
+        <w:tc>
+          <w:tcPr>
+            <w:tcW w:w="3900" w:type="dxa"/>
+          </w:tcPr>
+          <w:p>
+            <w:pPr>
+              <w:spacing w:before="100" w:beforeAutospacing="1" w:after="100" w:afterAutospacing="1"/>
+              <w:jc w:val="both"/>
+              <w:rPr>
+                <w:rFonts w:ascii="Times New Roman" w:eastAsia="Times New Roman" w:hAnsi="Times New Roman" w:cs="Times New Roman"/>
+                <w:sz w:val="24"/>
+                <w:szCs w:val="24"/>
+                <w:lang w:eastAsia="es-EC"/>
+              </w:rPr>
+            </w:pPr>
+            <w:r>
+              <w:rPr>
+                <w:rFonts w:ascii="Times New Roman" w:eastAsia="Times New Roman" w:hAnsi="Times New Roman" w:cs="Times New Roman"/>
+                <w:sz w:val="24"/>
+                <w:szCs w:val="24"/>
+                <w:lang w:eastAsia="es-EC"/>
+              </w:rPr>
+              <w:t>Se definieron fórmulas de matrícula académicas: Auto = 2 % del avalúo + 1 % del avalúo por año de antigüedad (este recargo llega como máximo al 10 %); Camioneta = 3 % del avalúo + 20 por tonelada de capacidad, con +15 %</w:t>
+            </w:r>
+            <w:r>
+              <w:rPr>
+                <w:rFonts w:ascii="Times New Roman" w:eastAsia="Times New Roman" w:hAnsi="Times New Roman" w:cs="Times New Roman"/>
+                <w:sz w:val="24"/>
+                <w:szCs w:val="24"/>
+                <w:lang w:eastAsia="es-EC"/>
+              </w:rPr>
+              <w:t xml:space="preserve"> sobre el total si el uso es comercial; Camión = 4 % del avalúo + 50 por tonelada.</w:t>
+            </w:r>
+          </w:p>
+        </w:tc>
+        <w:tc>
+          <w:tcPr>
+            <w:tcW w:w="5167" w:type="dxa"/>
+          </w:tcPr>
+          <w:p>
+            <w:pPr>
+              <w:spacing w:before="100" w:beforeAutospacing="1" w:after="100" w:afterAutospacing="1"/>
+              <w:jc w:val="both"/>
+              <w:rPr>
+                <w:rFonts w:ascii="Times New Roman" w:eastAsia="Times New Roman" w:hAnsi="Times New Roman" w:cs="Times New Roman"/>
+                <w:sz w:val="24"/>
+                <w:szCs w:val="24"/>
+                <w:lang w:eastAsia="es-EC"/>
+              </w:rPr>
+            </w:pPr>
+            <w:r>
+              <w:rPr>
+                <w:rFonts w:ascii="Times New Roman" w:eastAsia="Times New Roman" w:hAnsi="Times New Roman" w:cs="Times New Roman"/>
+                <w:sz w:val="24"/>
+                <w:szCs w:val="24"/>
+                <w:lang w:eastAsia="es-EC"/>
+              </w:rPr>
+              <w:t>El enunciado solo da criterios generales, por lo que son un supuesto del grupo.</w:t>
+            </w:r>
+          </w:p>
+        </w:tc>
+      </w:tr>
+      <w:tr>
+        <w:tc>
+          <w:tcPr>
+            <w:tcW w:w="3900" w:type="dxa"/>
+          </w:tcPr>
+          <w:p>
+            <w:pPr>
+              <w:spacing w:before="100" w:beforeAutospacing="1" w:after="100" w:afterAutospacing="1"/>
+              <w:jc w:val="both"/>
+              <w:rPr>
+                <w:rFonts w:ascii="Times New Roman" w:eastAsia="Times New Roman" w:hAnsi="Times New Roman" w:cs="Times New Roman"/>
+                <w:sz w:val="24"/>
+                <w:szCs w:val="24"/>
+                <w:lang w:eastAsia="es-EC"/>
+              </w:rPr>
+            </w:pPr>
+            <w:r>
+              <w:rPr>
+                <w:rFonts w:ascii="Times New Roman" w:eastAsia="Times New Roman" w:hAnsi="Times New Roman" w:cs="Times New Roman"/>
+                <w:sz w:val="24"/>
+                <w:szCs w:val="24"/>
+                <w:lang w:eastAsia="es-EC"/>
+              </w:rPr>
+              <w:t>Se agregó Main.java con un menú que selecciona el creador según el tipo elegido y solicita s</w:t>
+            </w:r>
+            <w:r>
+              <w:rPr>
+                <w:rFonts w:ascii="Times New Roman" w:eastAsia="Times New Roman" w:hAnsi="Times New Roman" w:cs="Times New Roman"/>
+                <w:sz w:val="24"/>
+                <w:szCs w:val="24"/>
+                <w:lang w:eastAsia="es-EC"/>
+              </w:rPr>
+              <w:t>us datos.</w:t>
+            </w:r>
+          </w:p>
+        </w:tc>
+        <w:tc>
+          <w:tcPr>
+            <w:tcW w:w="5167" w:type="dxa"/>
+          </w:tcPr>
+          <w:p>
+            <w:pPr>
+              <w:spacing w:before="100" w:beforeAutospacing="1" w:after="100" w:afterAutospacing="1"/>
+              <w:jc w:val="both"/>
+              <w:rPr>
+                <w:rFonts w:ascii="Times New Roman" w:eastAsia="Times New Roman" w:hAnsi="Times New Roman" w:cs="Times New Roman"/>
+                <w:sz w:val="24"/>
+                <w:szCs w:val="24"/>
+                <w:lang w:eastAsia="es-EC"/>
+              </w:rPr>
+            </w:pPr>
+            <w:r>
+              <w:rPr>
+                <w:rFonts w:ascii="Times New Roman" w:eastAsia="Times New Roman" w:hAnsi="Times New Roman" w:cs="Times New Roman"/>
+                <w:sz w:val="24"/>
+                <w:szCs w:val="24"/>
+                <w:lang w:eastAsia="es-EC"/>
+              </w:rPr>
+              <w:t>Demuestra que, tras elegir el creador, el resto del proceso solo usa CreadorVehiculo y Vehiculo.</w:t>
+            </w:r>
+          </w:p>
+        </w:tc>
+      </w:tr>
+    </w:tbl>
+    <w:p>
+      <w:pPr>
+        <w:jc w:val="both"/>
+        <w:rPr>
+          <w:rFonts w:ascii="Times New Roman" w:hAnsi="Times New Roman" w:cs="Times New Roman"/>
+          <w:sz w:val="24"/>
+          <w:szCs w:val="24"/>
+        </w:rPr>
+      </w:pPr>
+    </w:p>
+    <w:p>
+      <w:pPr>
+        <w:jc w:val="both"/>
+        <w:rPr>
+          <w:rFonts w:ascii="Times New Roman" w:hAnsi="Times New Roman" w:cs="Times New Roman"/>
+          <w:b/>
+          <w:bCs/>
+          <w:sz w:val="24"/>
+          <w:szCs w:val="24"/>
           <w:u w:val="single"/>
         </w:rPr>
-        <w:t>:</w:t>
+      </w:pPr>
+      <w:r>
+        <w:rPr>
+          <w:rFonts w:ascii="Times New Roman" w:hAnsi="Times New Roman" w:cs="Times New Roman"/>
+          <w:b/>
+          <w:bCs/>
+          <w:sz w:val="24"/>
+          <w:szCs w:val="24"/>
+          <w:u w:val="single"/>
+        </w:rPr>
+        <w:t>Escenario 2:</w:t>
       </w:r>
     </w:p>
     <w:p>
@@ -2594,7 +3921,6 @@
           <w:sz w:val="24"/>
           <w:szCs w:val="24"/>
         </w:rPr>
-        <w:lastRenderedPageBreak/>
         <w:t>Problema:</w:t>
       </w:r>
       <w:r>
@@ -2669,6 +3995,7 @@
           <w:sz w:val="24"/>
           <w:szCs w:val="24"/>
         </w:rPr>
+        <w:lastRenderedPageBreak/>
         <w:t>Requisitos:</w:t>
       </w:r>
       <w:r>
@@ -2912,15 +4239,7 @@
           <w:sz w:val="24"/>
           <w:szCs w:val="24"/>
         </w:rPr>
-        <w:t xml:space="preserve"> </w:t>
-      </w:r>
-      <w:r>
-        <w:rPr>
-          <w:rFonts w:ascii="Times New Roman" w:hAnsi="Times New Roman" w:cs="Times New Roman"/>
-          <w:sz w:val="24"/>
-          <w:szCs w:val="24"/>
-        </w:rPr>
-        <w:t>Las entidades identificadas mediante el enunciado son</w:t>
+        <w:t xml:space="preserve"> Las entidades identificadas mediante el enunciado son</w:t>
       </w:r>
     </w:p>
     <w:p>
@@ -3210,13 +4529,7 @@
         <w:jc w:val="both"/>
       </w:pPr>
       <w:r>
-        <w:t>M</w:t>
-      </w:r>
-      <w:r>
-        <w:t>arca</w:t>
-      </w:r>
-      <w:r>
-        <w:t>.</w:t>
+        <w:t>Marca.</w:t>
       </w:r>
     </w:p>
     <w:p>
@@ -3231,14 +4544,7 @@
         <w:jc w:val="both"/>
       </w:pPr>
       <w:r>
-        <w:lastRenderedPageBreak/>
-        <w:t>M</w:t>
-      </w:r>
-      <w:r>
-        <w:t>odelo</w:t>
-      </w:r>
-      <w:r>
-        <w:t>.</w:t>
+        <w:t>Modelo.</w:t>
       </w:r>
     </w:p>
     <w:p>
@@ -3253,13 +4559,7 @@
         <w:jc w:val="both"/>
       </w:pPr>
       <w:r>
-        <w:t>N</w:t>
-      </w:r>
-      <w:r>
-        <w:t>úmero de serie</w:t>
-      </w:r>
-      <w:r>
-        <w:t>.</w:t>
+        <w:t>Número de serie.</w:t>
       </w:r>
     </w:p>
     <w:p>
@@ -3274,13 +4574,7 @@
         <w:jc w:val="both"/>
       </w:pPr>
       <w:r>
-        <w:t>U</w:t>
-      </w:r>
-      <w:r>
-        <w:t>bicación</w:t>
-      </w:r>
-      <w:r>
-        <w:t>.</w:t>
+        <w:t>Ubicación.</w:t>
       </w:r>
     </w:p>
     <w:p>
@@ -3295,13 +4589,7 @@
         <w:jc w:val="both"/>
       </w:pPr>
       <w:r>
-        <w:t>Cu</w:t>
-      </w:r>
-      <w:r>
-        <w:t>stodio responsable</w:t>
-      </w:r>
-      <w:r>
-        <w:t>.</w:t>
+        <w:t>Custodio responsable.</w:t>
       </w:r>
     </w:p>
     <w:p>
@@ -3316,13 +4604,7 @@
         <w:jc w:val="both"/>
       </w:pPr>
       <w:r>
-        <w:t>F</w:t>
-      </w:r>
-      <w:r>
-        <w:t>echa de adquisición</w:t>
-      </w:r>
-      <w:r>
-        <w:t>.</w:t>
+        <w:t>Fecha de adquisición.</w:t>
       </w:r>
     </w:p>
     <w:p>
@@ -3337,13 +4619,7 @@
         <w:jc w:val="both"/>
       </w:pPr>
       <w:r>
-        <w:t>P</w:t>
-      </w:r>
-      <w:r>
-        <w:t>eríodo de garantía</w:t>
-      </w:r>
-      <w:r>
-        <w:t>.</w:t>
+        <w:t>Período de garantía.</w:t>
       </w:r>
     </w:p>
     <w:p>
@@ -3358,13 +4634,7 @@
         <w:jc w:val="both"/>
       </w:pPr>
       <w:r>
-        <w:t>P</w:t>
-      </w:r>
-      <w:r>
-        <w:t>roveedor</w:t>
-      </w:r>
-      <w:r>
-        <w:t>.</w:t>
+        <w:t>Proveedor.</w:t>
       </w:r>
     </w:p>
     <w:p>
@@ -3379,13 +4649,7 @@
         <w:jc w:val="both"/>
       </w:pPr>
       <w:r>
-        <w:t>C</w:t>
-      </w:r>
-      <w:r>
-        <w:t>aracterísticas técnicas</w:t>
-      </w:r>
-      <w:r>
-        <w:t>.</w:t>
+        <w:t>Características técnicas.</w:t>
       </w:r>
     </w:p>
     <w:p>
@@ -3400,10 +4664,7 @@
         <w:jc w:val="both"/>
       </w:pPr>
       <w:r>
-        <w:t>O</w:t>
-      </w:r>
-      <w:r>
-        <w:t>bservaciones.</w:t>
+        <w:t>Observaciones.</w:t>
       </w:r>
     </w:p>
     <w:p>
@@ -3436,23 +4697,8 @@
           <w:sz w:val="24"/>
           <w:szCs w:val="24"/>
         </w:rPr>
-        <w:t xml:space="preserve">Seleccionar y justificar el </w:t>
-      </w:r>
-      <w:r>
-        <w:rPr>
-          <w:rFonts w:ascii="Times New Roman" w:hAnsi="Times New Roman" w:cs="Times New Roman"/>
-          <w:sz w:val="24"/>
-          <w:szCs w:val="24"/>
-        </w:rPr>
-        <w:t>patrón</w:t>
-      </w:r>
-      <w:r>
-        <w:rPr>
-          <w:rFonts w:ascii="Times New Roman" w:hAnsi="Times New Roman" w:cs="Times New Roman"/>
-          <w:sz w:val="24"/>
-          <w:szCs w:val="24"/>
-        </w:rPr>
-        <w:t xml:space="preserve"> creacional correspondiente</w:t>
+        <w:lastRenderedPageBreak/>
+        <w:t>Seleccionar y justificar el patrón creacional correspondiente</w:t>
       </w:r>
     </w:p>
     <w:p>
@@ -3488,23 +4734,7 @@
           <w:sz w:val="24"/>
           <w:szCs w:val="24"/>
         </w:rPr>
-        <w:t>, ya que permite construir objetos paso a paso, separando el proceso de construcción del objeto final.</w:t>
-      </w:r>
-      <w:r>
-        <w:rPr>
-          <w:rFonts w:ascii="Times New Roman" w:hAnsi="Times New Roman" w:cs="Times New Roman"/>
-          <w:sz w:val="24"/>
-          <w:szCs w:val="24"/>
-        </w:rPr>
-        <w:t xml:space="preserve"> </w:t>
-      </w:r>
-      <w:r>
-        <w:rPr>
-          <w:rFonts w:ascii="Times New Roman" w:hAnsi="Times New Roman" w:cs="Times New Roman"/>
-          <w:sz w:val="24"/>
-          <w:szCs w:val="24"/>
-        </w:rPr>
-        <w:t xml:space="preserve">En este caso, los activos fijos tienen atributos obligatorios y opcionales, por lo que </w:t>
+        <w:t xml:space="preserve">, ya que permite construir objetos paso a paso, separando el proceso de construcción del objeto final. En este caso, los activos fijos tienen atributos obligatorios y opcionales, por lo que </w:t>
       </w:r>
       <w:proofErr w:type="spellStart"/>
       <w:r>
@@ -3522,23 +4752,7 @@
           <w:sz w:val="24"/>
           <w:szCs w:val="24"/>
         </w:rPr>
-        <w:t xml:space="preserve"> permite establecer primero la información necesaria y agregar después las características que correspond</w:t>
-      </w:r>
-      <w:r>
-        <w:rPr>
-          <w:rFonts w:ascii="Times New Roman" w:hAnsi="Times New Roman" w:cs="Times New Roman"/>
-          <w:sz w:val="24"/>
-          <w:szCs w:val="24"/>
-        </w:rPr>
-        <w:t>en</w:t>
-      </w:r>
-      <w:r>
-        <w:rPr>
-          <w:rFonts w:ascii="Times New Roman" w:hAnsi="Times New Roman" w:cs="Times New Roman"/>
-          <w:sz w:val="24"/>
-          <w:szCs w:val="24"/>
-        </w:rPr>
-        <w:t xml:space="preserve"> a cada activo, evitando utilizar constructores con demasiados parámetros.</w:t>
+        <w:t xml:space="preserve"> permite establecer primero la información necesaria y agregar después las características que corresponden a cada activo, evitando utilizar constructores con demasiados parámetros.</w:t>
       </w:r>
     </w:p>
     <w:tbl>
@@ -3913,16 +5127,7 @@
           <w:szCs w:val="24"/>
           <w:lang w:eastAsia="es-EC"/>
         </w:rPr>
-        <w:t xml:space="preserve">Tenemos que manejar las siguientes clases principales para diseñar según el patrón </w:t>
-      </w:r>
-      <w:r>
-        <w:rPr>
-          <w:rFonts w:ascii="Times New Roman" w:eastAsia="Times New Roman" w:hAnsi="Times New Roman" w:cs="Times New Roman"/>
-          <w:sz w:val="24"/>
-          <w:szCs w:val="24"/>
-          <w:lang w:eastAsia="es-EC"/>
-        </w:rPr>
-        <w:t xml:space="preserve">tradicional de </w:t>
+        <w:t xml:space="preserve">Tenemos que manejar las siguientes clases principales para diseñar según el patrón tradicional de </w:t>
       </w:r>
       <w:proofErr w:type="spellStart"/>
       <w:r>
@@ -4294,22 +5499,21 @@
     </w:p>
     <w:p>
       <w:pPr>
-        <w:jc w:val="both"/>
-        <w:rPr>
-          <w:rFonts w:ascii="Times New Roman" w:hAnsi="Times New Roman" w:cs="Times New Roman"/>
-          <w:sz w:val="24"/>
-          <w:szCs w:val="24"/>
-        </w:rPr>
-      </w:pPr>
-      <w:r>
-        <w:rPr>
-          <w:rFonts w:ascii="Times New Roman" w:hAnsi="Times New Roman" w:cs="Times New Roman"/>
+        <w:keepNext/>
+        <w:rPr>
+          <w:rFonts w:ascii="Times New Roman" w:hAnsi="Times New Roman" w:cs="Times New Roman"/>
+        </w:rPr>
+      </w:pPr>
+      <w:r>
+        <w:rPr>
+          <w:rFonts w:ascii="Times New Roman" w:hAnsi="Times New Roman" w:cs="Times New Roman"/>
+          <w:noProof/>
           <w:sz w:val="24"/>
           <w:szCs w:val="24"/>
         </w:rPr>
         <w:lastRenderedPageBreak/>
         <w:drawing>
-          <wp:inline distT="0" distB="0" distL="0" distR="0" wp14:anchorId="4C06F1A6" wp14:editId="6DDA9E08">
+          <wp:inline distT="0" distB="0" distL="0" distR="0" wp14:anchorId="09C7E18E" wp14:editId="5424C759">
             <wp:extent cx="5731510" cy="4227195"/>
             <wp:effectExtent l="0" t="0" r="2540" b="1905"/>
             <wp:docPr id="2" name="Imagen 2"/>
@@ -4324,7 +5528,7 @@
                     <pic:cNvPicPr/>
                   </pic:nvPicPr>
                   <pic:blipFill>
-                    <a:blip r:embed="rId7"/>
+                    <a:blip r:embed="rId9"/>
                     <a:stretch>
                       <a:fillRect/>
                     </a:stretch>
@@ -4347,13 +5551,624 @@
     </w:p>
     <w:p>
       <w:pPr>
-        <w:jc w:val="both"/>
-        <w:rPr>
-          <w:rFonts w:ascii="Times New Roman" w:hAnsi="Times New Roman" w:cs="Times New Roman"/>
-          <w:sz w:val="24"/>
-          <w:szCs w:val="24"/>
-        </w:rPr>
-      </w:pPr>
+        <w:pStyle w:val="Descripcin"/>
+        <w:jc w:val="center"/>
+        <w:rPr>
+          <w:rFonts w:ascii="Times New Roman" w:hAnsi="Times New Roman" w:cs="Times New Roman"/>
+          <w:sz w:val="24"/>
+          <w:szCs w:val="24"/>
+        </w:rPr>
+      </w:pPr>
+      <w:r>
+        <w:rPr>
+          <w:rFonts w:ascii="Times New Roman" w:hAnsi="Times New Roman" w:cs="Times New Roman"/>
+        </w:rPr>
+        <w:t xml:space="preserve">Ilustración </w:t>
+      </w:r>
+      <w:r>
+        <w:rPr>
+          <w:rFonts w:ascii="Times New Roman" w:hAnsi="Times New Roman" w:cs="Times New Roman"/>
+        </w:rPr>
+        <w:fldChar w:fldCharType="begin"/>
+      </w:r>
+      <w:r>
+        <w:rPr>
+          <w:rFonts w:ascii="Times New Roman" w:hAnsi="Times New Roman" w:cs="Times New Roman"/>
+        </w:rPr>
+        <w:instrText xml:space="preserve"> SEQ Ilustración \* ARABIC </w:instrText>
+      </w:r>
+      <w:r>
+        <w:rPr>
+          <w:rFonts w:ascii="Times New Roman" w:hAnsi="Times New Roman" w:cs="Times New Roman"/>
+        </w:rPr>
+        <w:fldChar w:fldCharType="separate"/>
+      </w:r>
+      <w:r>
+        <w:rPr>
+          <w:rFonts w:ascii="Times New Roman" w:hAnsi="Times New Roman" w:cs="Times New Roman"/>
+          <w:noProof/>
+        </w:rPr>
+        <w:t>3</w:t>
+      </w:r>
+      <w:r>
+        <w:rPr>
+          <w:rFonts w:ascii="Times New Roman" w:hAnsi="Times New Roman" w:cs="Times New Roman"/>
+        </w:rPr>
+        <w:fldChar w:fldCharType="end"/>
+      </w:r>
+      <w:r>
+        <w:rPr>
+          <w:rFonts w:ascii="Times New Roman" w:hAnsi="Times New Roman" w:cs="Times New Roman"/>
+        </w:rPr>
+        <w:t xml:space="preserve">. Diagrama </w:t>
+      </w:r>
+      <w:proofErr w:type="spellStart"/>
+      <w:r>
+        <w:rPr>
+          <w:rFonts w:ascii="Times New Roman" w:hAnsi="Times New Roman" w:cs="Times New Roman"/>
+        </w:rPr>
+        <w:t>Builder</w:t>
+      </w:r>
+      <w:proofErr w:type="spellEnd"/>
+      <w:r>
+        <w:rPr>
+          <w:rFonts w:ascii="Times New Roman" w:hAnsi="Times New Roman" w:cs="Times New Roman"/>
+        </w:rPr>
+        <w:t xml:space="preserve"> inicial</w:t>
+      </w:r>
+    </w:p>
+    <w:p>
+      <w:pPr>
+        <w:keepNext/>
+        <w:jc w:val="center"/>
+        <w:rPr>
+          <w:rFonts w:ascii="Times New Roman" w:hAnsi="Times New Roman" w:cs="Times New Roman"/>
+        </w:rPr>
+      </w:pPr>
+      <w:r>
+        <w:rPr>
+          <w:rFonts w:ascii="Times New Roman" w:hAnsi="Times New Roman" w:cs="Times New Roman"/>
+          <w:noProof/>
+        </w:rPr>
+        <w:lastRenderedPageBreak/>
+        <w:drawing>
+          <wp:inline distT="0" distB="0" distL="0" distR="0" wp14:anchorId="4E84A093" wp14:editId="47E843C2">
+            <wp:extent cx="5731510" cy="5371465"/>
+            <wp:effectExtent l="0" t="0" r="2540" b="635"/>
+            <wp:docPr id="6" name="Imagen 6"/>
+            <wp:cNvGraphicFramePr>
+              <a:graphicFrameLocks xmlns:a="http://schemas.openxmlformats.org/drawingml/2006/main" noChangeAspect="1"/>
+            </wp:cNvGraphicFramePr>
+            <a:graphic xmlns:a="http://schemas.openxmlformats.org/drawingml/2006/main">
+              <a:graphicData uri="http://schemas.openxmlformats.org/drawingml/2006/picture">
+                <pic:pic xmlns:pic="http://schemas.openxmlformats.org/drawingml/2006/picture">
+                  <pic:nvPicPr>
+                    <pic:cNvPr id="0" name="Picture 3"/>
+                    <pic:cNvPicPr>
+                      <a:picLocks noChangeAspect="1" noChangeArrowheads="1"/>
+                    </pic:cNvPicPr>
+                  </pic:nvPicPr>
+                  <pic:blipFill>
+                    <a:blip r:embed="rId10">
+                      <a:extLst>
+                        <a:ext uri="{28A0092B-C50C-407E-A947-70E740481C1C}">
+                          <a14:useLocalDpi xmlns:a14="http://schemas.microsoft.com/office/drawing/2010/main" val="0"/>
+                        </a:ext>
+                      </a:extLst>
+                    </a:blip>
+                    <a:srcRect/>
+                    <a:stretch>
+                      <a:fillRect/>
+                    </a:stretch>
+                  </pic:blipFill>
+                  <pic:spPr bwMode="auto">
+                    <a:xfrm>
+                      <a:off x="0" y="0"/>
+                      <a:ext cx="5731510" cy="5371465"/>
+                    </a:xfrm>
+                    <a:prstGeom prst="rect">
+                      <a:avLst/>
+                    </a:prstGeom>
+                    <a:noFill/>
+                    <a:ln>
+                      <a:noFill/>
+                    </a:ln>
+                  </pic:spPr>
+                </pic:pic>
+              </a:graphicData>
+            </a:graphic>
+          </wp:inline>
+        </w:drawing>
+      </w:r>
+    </w:p>
+    <w:p>
+      <w:pPr>
+        <w:pStyle w:val="Descripcin"/>
+        <w:jc w:val="center"/>
+        <w:rPr>
+          <w:rFonts w:ascii="Times New Roman" w:hAnsi="Times New Roman" w:cs="Times New Roman"/>
+          <w:sz w:val="24"/>
+          <w:szCs w:val="24"/>
+        </w:rPr>
+      </w:pPr>
+      <w:r>
+        <w:rPr>
+          <w:rFonts w:ascii="Times New Roman" w:hAnsi="Times New Roman" w:cs="Times New Roman"/>
+        </w:rPr>
+        <w:t xml:space="preserve">Ilustración </w:t>
+      </w:r>
+      <w:r>
+        <w:rPr>
+          <w:rFonts w:ascii="Times New Roman" w:hAnsi="Times New Roman" w:cs="Times New Roman"/>
+        </w:rPr>
+        <w:fldChar w:fldCharType="begin"/>
+      </w:r>
+      <w:r>
+        <w:rPr>
+          <w:rFonts w:ascii="Times New Roman" w:hAnsi="Times New Roman" w:cs="Times New Roman"/>
+        </w:rPr>
+        <w:instrText xml:space="preserve"> SEQ Ilustración \* ARABIC </w:instrText>
+      </w:r>
+      <w:r>
+        <w:rPr>
+          <w:rFonts w:ascii="Times New Roman" w:hAnsi="Times New Roman" w:cs="Times New Roman"/>
+        </w:rPr>
+        <w:fldChar w:fldCharType="separate"/>
+      </w:r>
+      <w:r>
+        <w:rPr>
+          <w:rFonts w:ascii="Times New Roman" w:hAnsi="Times New Roman" w:cs="Times New Roman"/>
+          <w:noProof/>
+        </w:rPr>
+        <w:t>4</w:t>
+      </w:r>
+      <w:r>
+        <w:rPr>
+          <w:rFonts w:ascii="Times New Roman" w:hAnsi="Times New Roman" w:cs="Times New Roman"/>
+        </w:rPr>
+        <w:fldChar w:fldCharType="end"/>
+      </w:r>
+      <w:r>
+        <w:rPr>
+          <w:rFonts w:ascii="Times New Roman" w:hAnsi="Times New Roman" w:cs="Times New Roman"/>
+        </w:rPr>
+        <w:t xml:space="preserve">. Diagrama </w:t>
+      </w:r>
+      <w:proofErr w:type="spellStart"/>
+      <w:r>
+        <w:rPr>
+          <w:rFonts w:ascii="Times New Roman" w:hAnsi="Times New Roman" w:cs="Times New Roman"/>
+        </w:rPr>
+        <w:t>Builder</w:t>
+      </w:r>
+      <w:proofErr w:type="spellEnd"/>
+      <w:r>
+        <w:rPr>
+          <w:rFonts w:ascii="Times New Roman" w:hAnsi="Times New Roman" w:cs="Times New Roman"/>
+        </w:rPr>
+        <w:t xml:space="preserve"> Final</w:t>
+      </w:r>
+    </w:p>
+    <w:p>
+      <w:pPr>
+        <w:pStyle w:val="Prrafodelista"/>
+        <w:numPr>
+          <w:ilvl w:val="0"/>
+          <w:numId w:val="3"/>
+        </w:numPr>
+        <w:jc w:val="both"/>
+        <w:rPr>
+          <w:rFonts w:ascii="Times New Roman" w:eastAsia="Times New Roman" w:hAnsi="Times New Roman" w:cs="Times New Roman"/>
+          <w:sz w:val="24"/>
+          <w:szCs w:val="24"/>
+        </w:rPr>
+      </w:pPr>
+      <w:r>
+        <w:rPr>
+          <w:rFonts w:ascii="Times New Roman" w:eastAsia="Times New Roman" w:hAnsi="Times New Roman" w:cs="Times New Roman"/>
+          <w:sz w:val="24"/>
+          <w:szCs w:val="24"/>
+        </w:rPr>
+        <w:t>Código fuente</w:t>
+      </w:r>
+    </w:p>
+    <w:p>
+      <w:pPr>
+        <w:spacing w:before="100" w:beforeAutospacing="1" w:after="100" w:afterAutospacing="1" w:line="240" w:lineRule="auto"/>
+        <w:jc w:val="both"/>
+        <w:rPr>
+          <w:rFonts w:ascii="Times New Roman" w:eastAsia="Times New Roman" w:hAnsi="Times New Roman" w:cs="Times New Roman"/>
+          <w:sz w:val="24"/>
+          <w:szCs w:val="24"/>
+          <w:lang w:eastAsia="es-EC"/>
+        </w:rPr>
+      </w:pPr>
+      <w:r>
+        <w:rPr>
+          <w:rFonts w:ascii="Times New Roman" w:eastAsia="Times New Roman" w:hAnsi="Times New Roman" w:cs="Times New Roman"/>
+          <w:sz w:val="24"/>
+          <w:szCs w:val="24"/>
+          <w:lang w:eastAsia="es-EC"/>
+        </w:rPr>
+        <w:t>El código está en codigo-escenario-2/ (Java 17+, paquete activos). Correspondencia con el diagrama:</w:t>
+      </w:r>
+    </w:p>
+    <w:tbl>
+      <w:tblPr>
+        <w:tblStyle w:val="Tablaconcuadrcula"/>
+        <w:tblW w:w="9067" w:type="dxa"/>
+        <w:tblLook w:val="04A0" w:firstRow="1" w:lastRow="0" w:firstColumn="1" w:lastColumn="0" w:noHBand="0" w:noVBand="1"/>
+      </w:tblPr>
+      <w:tblGrid>
+        <w:gridCol w:w="3256"/>
+        <w:gridCol w:w="5811"/>
+      </w:tblGrid>
+      <w:tr>
+        <w:tc>
+          <w:tcPr>
+            <w:tcW w:w="3256" w:type="dxa"/>
+          </w:tcPr>
+          <w:p>
+            <w:pPr>
+              <w:spacing w:before="100" w:beforeAutospacing="1" w:after="100" w:afterAutospacing="1"/>
+              <w:jc w:val="both"/>
+              <w:rPr>
+                <w:rFonts w:ascii="Times New Roman" w:eastAsia="Times New Roman" w:hAnsi="Times New Roman" w:cs="Times New Roman"/>
+                <w:b/>
+                <w:bCs/>
+                <w:sz w:val="24"/>
+                <w:szCs w:val="24"/>
+                <w:lang w:eastAsia="es-EC"/>
+              </w:rPr>
+            </w:pPr>
+            <w:r>
+              <w:rPr>
+                <w:rFonts w:ascii="Times New Roman" w:eastAsia="Times New Roman" w:hAnsi="Times New Roman" w:cs="Times New Roman"/>
+                <w:b/>
+                <w:bCs/>
+                <w:sz w:val="24"/>
+                <w:szCs w:val="24"/>
+                <w:lang w:eastAsia="es-EC"/>
+              </w:rPr>
+              <w:t>Participante</w:t>
+            </w:r>
+          </w:p>
+        </w:tc>
+        <w:tc>
+          <w:tcPr>
+            <w:tcW w:w="5811" w:type="dxa"/>
+          </w:tcPr>
+          <w:p>
+            <w:pPr>
+              <w:spacing w:before="100" w:beforeAutospacing="1" w:after="100" w:afterAutospacing="1"/>
+              <w:jc w:val="both"/>
+              <w:rPr>
+                <w:rFonts w:ascii="Times New Roman" w:eastAsia="Times New Roman" w:hAnsi="Times New Roman" w:cs="Times New Roman"/>
+                <w:b/>
+                <w:bCs/>
+                <w:sz w:val="24"/>
+                <w:szCs w:val="24"/>
+                <w:lang w:eastAsia="es-EC"/>
+              </w:rPr>
+            </w:pPr>
+            <w:r>
+              <w:rPr>
+                <w:rFonts w:ascii="Times New Roman" w:eastAsia="Times New Roman" w:hAnsi="Times New Roman" w:cs="Times New Roman"/>
+                <w:b/>
+                <w:bCs/>
+                <w:sz w:val="24"/>
+                <w:szCs w:val="24"/>
+                <w:lang w:eastAsia="es-EC"/>
+              </w:rPr>
+              <w:t>Clase</w:t>
+            </w:r>
+          </w:p>
+        </w:tc>
+      </w:tr>
+      <w:tr>
+        <w:tc>
+          <w:tcPr>
+            <w:tcW w:w="3256" w:type="dxa"/>
+          </w:tcPr>
+          <w:p>
+            <w:pPr>
+              <w:spacing w:before="100" w:beforeAutospacing="1" w:after="100" w:afterAutospacing="1"/>
+              <w:jc w:val="both"/>
+              <w:rPr>
+                <w:rFonts w:ascii="Times New Roman" w:eastAsia="Times New Roman" w:hAnsi="Times New Roman" w:cs="Times New Roman"/>
+                <w:sz w:val="24"/>
+                <w:szCs w:val="24"/>
+                <w:lang w:eastAsia="es-EC"/>
+              </w:rPr>
+            </w:pPr>
+            <w:r>
+              <w:rPr>
+                <w:rFonts w:ascii="Times New Roman" w:eastAsia="Times New Roman" w:hAnsi="Times New Roman" w:cs="Times New Roman"/>
+                <w:sz w:val="24"/>
+                <w:szCs w:val="24"/>
+                <w:lang w:eastAsia="es-EC"/>
+              </w:rPr>
+              <w:t>Product</w:t>
+            </w:r>
+          </w:p>
+        </w:tc>
+        <w:tc>
+          <w:tcPr>
+            <w:tcW w:w="5811" w:type="dxa"/>
+          </w:tcPr>
+          <w:p>
+            <w:pPr>
+              <w:spacing w:before="100" w:beforeAutospacing="1" w:after="100" w:afterAutospacing="1"/>
+              <w:jc w:val="both"/>
+              <w:rPr>
+                <w:rFonts w:ascii="Times New Roman" w:eastAsia="Times New Roman" w:hAnsi="Times New Roman" w:cs="Times New Roman"/>
+                <w:sz w:val="24"/>
+                <w:szCs w:val="24"/>
+                <w:lang w:eastAsia="es-EC"/>
+              </w:rPr>
+            </w:pPr>
+            <w:r>
+              <w:rPr>
+                <w:rFonts w:ascii="Times New Roman" w:eastAsia="Times New Roman" w:hAnsi="Times New Roman" w:cs="Times New Roman"/>
+                <w:sz w:val="24"/>
+                <w:szCs w:val="24"/>
+                <w:lang w:eastAsia="es-EC"/>
+              </w:rPr>
+              <w:t>activos.construccion.ActivoFijo</w:t>
+            </w:r>
+          </w:p>
+        </w:tc>
+      </w:tr>
+      <w:tr>
+        <w:tc>
+          <w:tcPr>
+            <w:tcW w:w="3256" w:type="dxa"/>
+          </w:tcPr>
+          <w:p>
+            <w:pPr>
+              <w:spacing w:before="100" w:beforeAutospacing="1" w:after="100" w:afterAutospacing="1"/>
+              <w:jc w:val="both"/>
+              <w:rPr>
+                <w:rFonts w:ascii="Times New Roman" w:eastAsia="Times New Roman" w:hAnsi="Times New Roman" w:cs="Times New Roman"/>
+                <w:sz w:val="24"/>
+                <w:szCs w:val="24"/>
+                <w:lang w:eastAsia="es-EC"/>
+              </w:rPr>
+            </w:pPr>
+            <w:r>
+              <w:rPr>
+                <w:rFonts w:ascii="Times New Roman" w:eastAsia="Times New Roman" w:hAnsi="Times New Roman" w:cs="Times New Roman"/>
+                <w:sz w:val="24"/>
+                <w:szCs w:val="24"/>
+                <w:lang w:eastAsia="es-EC"/>
+              </w:rPr>
+              <w:t>Builder</w:t>
+            </w:r>
+          </w:p>
+        </w:tc>
+        <w:tc>
+          <w:tcPr>
+            <w:tcW w:w="5811" w:type="dxa"/>
+          </w:tcPr>
+          <w:p>
+            <w:pPr>
+              <w:spacing w:before="100" w:beforeAutospacing="1" w:after="100" w:afterAutospacing="1"/>
+              <w:jc w:val="both"/>
+              <w:rPr>
+                <w:rFonts w:ascii="Times New Roman" w:eastAsia="Times New Roman" w:hAnsi="Times New Roman" w:cs="Times New Roman"/>
+                <w:sz w:val="24"/>
+                <w:szCs w:val="24"/>
+                <w:lang w:eastAsia="es-EC"/>
+              </w:rPr>
+            </w:pPr>
+            <w:r>
+              <w:rPr>
+                <w:rFonts w:ascii="Times New Roman" w:eastAsia="Times New Roman" w:hAnsi="Times New Roman" w:cs="Times New Roman"/>
+                <w:sz w:val="24"/>
+                <w:szCs w:val="24"/>
+                <w:lang w:eastAsia="es-EC"/>
+              </w:rPr>
+              <w:t>activos.construccion.ActivoFijoBuilder</w:t>
+            </w:r>
+          </w:p>
+        </w:tc>
+      </w:tr>
+      <w:tr>
+        <w:tc>
+          <w:tcPr>
+            <w:tcW w:w="3256" w:type="dxa"/>
+          </w:tcPr>
+          <w:p>
+            <w:pPr>
+              <w:spacing w:before="100" w:beforeAutospacing="1" w:after="100" w:afterAutospacing="1"/>
+              <w:jc w:val="both"/>
+              <w:rPr>
+                <w:rFonts w:ascii="Times New Roman" w:eastAsia="Times New Roman" w:hAnsi="Times New Roman" w:cs="Times New Roman"/>
+                <w:sz w:val="24"/>
+                <w:szCs w:val="24"/>
+                <w:lang w:eastAsia="es-EC"/>
+              </w:rPr>
+            </w:pPr>
+            <w:r>
+              <w:rPr>
+                <w:rFonts w:ascii="Times New Roman" w:eastAsia="Times New Roman" w:hAnsi="Times New Roman" w:cs="Times New Roman"/>
+                <w:sz w:val="24"/>
+                <w:szCs w:val="24"/>
+                <w:lang w:eastAsia="es-EC"/>
+              </w:rPr>
+              <w:t>ConcreteBuilder</w:t>
+            </w:r>
+          </w:p>
+        </w:tc>
+        <w:tc>
+          <w:tcPr>
+            <w:tcW w:w="5811" w:type="dxa"/>
+          </w:tcPr>
+          <w:p>
+            <w:pPr>
+              <w:spacing w:before="100" w:beforeAutospacing="1" w:after="100" w:afterAutospacing="1"/>
+              <w:jc w:val="both"/>
+              <w:rPr>
+                <w:rFonts w:ascii="Times New Roman" w:eastAsia="Times New Roman" w:hAnsi="Times New Roman" w:cs="Times New Roman"/>
+                <w:sz w:val="24"/>
+                <w:szCs w:val="24"/>
+                <w:lang w:eastAsia="es-EC"/>
+              </w:rPr>
+            </w:pPr>
+            <w:r>
+              <w:rPr>
+                <w:rFonts w:ascii="Times New Roman" w:eastAsia="Times New Roman" w:hAnsi="Times New Roman" w:cs="Times New Roman"/>
+                <w:sz w:val="24"/>
+                <w:szCs w:val="24"/>
+                <w:lang w:eastAsia="es-EC"/>
+              </w:rPr>
+              <w:t>activos.construccion.ConstructorActivoFijo</w:t>
+            </w:r>
+          </w:p>
+        </w:tc>
+      </w:tr>
+      <w:tr>
+        <w:tc>
+          <w:tcPr>
+            <w:tcW w:w="3256" w:type="dxa"/>
+          </w:tcPr>
+          <w:p>
+            <w:pPr>
+              <w:spacing w:before="100" w:beforeAutospacing="1" w:after="100" w:afterAutospacing="1"/>
+              <w:jc w:val="both"/>
+              <w:rPr>
+                <w:rFonts w:ascii="Times New Roman" w:eastAsia="Times New Roman" w:hAnsi="Times New Roman" w:cs="Times New Roman"/>
+                <w:sz w:val="24"/>
+                <w:szCs w:val="24"/>
+                <w:lang w:eastAsia="es-EC"/>
+              </w:rPr>
+            </w:pPr>
+            <w:r>
+              <w:rPr>
+                <w:rFonts w:ascii="Times New Roman" w:eastAsia="Times New Roman" w:hAnsi="Times New Roman" w:cs="Times New Roman"/>
+                <w:sz w:val="24"/>
+                <w:szCs w:val="24"/>
+                <w:lang w:eastAsia="es-EC"/>
+              </w:rPr>
+              <w:t>Director</w:t>
+            </w:r>
+          </w:p>
+        </w:tc>
+        <w:tc>
+          <w:tcPr>
+            <w:tcW w:w="5811" w:type="dxa"/>
+          </w:tcPr>
+          <w:p>
+            <w:pPr>
+              <w:spacing w:before="100" w:beforeAutospacing="1" w:after="100" w:afterAutospacing="1"/>
+              <w:jc w:val="both"/>
+              <w:rPr>
+                <w:rFonts w:ascii="Times New Roman" w:eastAsia="Times New Roman" w:hAnsi="Times New Roman" w:cs="Times New Roman"/>
+                <w:sz w:val="24"/>
+                <w:szCs w:val="24"/>
+                <w:lang w:eastAsia="es-EC"/>
+              </w:rPr>
+            </w:pPr>
+            <w:r>
+              <w:rPr>
+                <w:rFonts w:ascii="Times New Roman" w:eastAsia="Times New Roman" w:hAnsi="Times New Roman" w:cs="Times New Roman"/>
+                <w:sz w:val="24"/>
+                <w:szCs w:val="24"/>
+                <w:lang w:eastAsia="es-EC"/>
+              </w:rPr>
+              <w:t>activos.construccion.DirectorActivoFijo</w:t>
+            </w:r>
+          </w:p>
+        </w:tc>
+      </w:tr>
+      <w:tr>
+        <w:tc>
+          <w:tcPr>
+            <w:tcW w:w="3256" w:type="dxa"/>
+          </w:tcPr>
+          <w:p>
+            <w:pPr>
+              <w:spacing w:before="100" w:beforeAutospacing="1" w:after="100" w:afterAutospacing="1"/>
+              <w:jc w:val="both"/>
+              <w:rPr>
+                <w:rFonts w:ascii="Times New Roman" w:eastAsia="Times New Roman" w:hAnsi="Times New Roman" w:cs="Times New Roman"/>
+                <w:sz w:val="24"/>
+                <w:szCs w:val="24"/>
+                <w:lang w:eastAsia="es-EC"/>
+              </w:rPr>
+            </w:pPr>
+            <w:r>
+              <w:rPr>
+                <w:rFonts w:ascii="Times New Roman" w:eastAsia="Times New Roman" w:hAnsi="Times New Roman" w:cs="Times New Roman"/>
+                <w:sz w:val="24"/>
+                <w:szCs w:val="24"/>
+                <w:lang w:eastAsia="es-EC"/>
+              </w:rPr>
+              <w:t>Cliente</w:t>
+            </w:r>
+          </w:p>
+        </w:tc>
+        <w:tc>
+          <w:tcPr>
+            <w:tcW w:w="5811" w:type="dxa"/>
+          </w:tcPr>
+          <w:p>
+            <w:pPr>
+              <w:spacing w:before="100" w:beforeAutospacing="1" w:after="100" w:afterAutospacing="1"/>
+              <w:jc w:val="both"/>
+              <w:rPr>
+                <w:rFonts w:ascii="Times New Roman" w:eastAsia="Times New Roman" w:hAnsi="Times New Roman" w:cs="Times New Roman"/>
+                <w:sz w:val="24"/>
+                <w:szCs w:val="24"/>
+                <w:lang w:eastAsia="es-EC"/>
+              </w:rPr>
+            </w:pPr>
+            <w:r>
+              <w:rPr>
+                <w:rFonts w:ascii="Times New Roman" w:eastAsia="Times New Roman" w:hAnsi="Times New Roman" w:cs="Times New Roman"/>
+                <w:sz w:val="24"/>
+                <w:szCs w:val="24"/>
+                <w:lang w:eastAsia="es-EC"/>
+              </w:rPr>
+              <w:t>activos.Main</w:t>
+            </w:r>
+          </w:p>
+        </w:tc>
+      </w:tr>
+    </w:tbl>
+    <w:p>
+      <w:pPr>
+        <w:jc w:val="both"/>
+        <w:rPr>
+          <w:rFonts w:ascii="Times New Roman" w:eastAsia="Times New Roman" w:hAnsi="Times New Roman" w:cs="Times New Roman"/>
+          <w:sz w:val="24"/>
+          <w:szCs w:val="24"/>
+          <w:lang w:eastAsia="es-EC"/>
+        </w:rPr>
+      </w:pPr>
+    </w:p>
+    <w:p>
+      <w:pPr>
+        <w:pStyle w:val="Prrafodelista"/>
+        <w:numPr>
+          <w:ilvl w:val="0"/>
+          <w:numId w:val="3"/>
+        </w:numPr>
+        <w:jc w:val="both"/>
+        <w:rPr>
+          <w:rFonts w:ascii="Times New Roman" w:eastAsia="Times New Roman" w:hAnsi="Times New Roman" w:cs="Times New Roman"/>
+          <w:sz w:val="24"/>
+          <w:szCs w:val="24"/>
+        </w:rPr>
+      </w:pPr>
+      <w:r>
+        <w:rPr>
+          <w:rFonts w:ascii="Times New Roman" w:eastAsia="Times New Roman" w:hAnsi="Times New Roman" w:cs="Times New Roman"/>
+          <w:sz w:val="24"/>
+          <w:szCs w:val="24"/>
+        </w:rPr>
+        <w:t>Uso crítico de inteligencia artificial</w:t>
+      </w:r>
     </w:p>
     <w:p>
       <w:pPr>
@@ -4372,7 +6187,7 @@
         </w:rPr>
         <w:t xml:space="preserve">Link del análisis: </w:t>
       </w:r>
-      <w:hyperlink r:id="rId8" w:history="1">
+      <w:hyperlink r:id="rId11" w:history="1">
         <w:r>
           <w:rPr>
             <w:rStyle w:val="Hipervnculo"/>
@@ -4414,6 +6229,7 @@
           <w:sz w:val="24"/>
           <w:szCs w:val="24"/>
         </w:rPr>
+        <w:lastRenderedPageBreak/>
         <w:t>Prompt</w:t>
       </w:r>
       <w:proofErr w:type="spellEnd"/>
@@ -4673,7 +6489,6 @@
           <w:szCs w:val="24"/>
           <w:lang w:eastAsia="es-EC"/>
         </w:rPr>
-        <w:lastRenderedPageBreak/>
         <w:t xml:space="preserve">Propón las clases necesarias para aplicar el patrón, utilizando su estructura tradicional: </w:t>
       </w:r>
       <w:proofErr w:type="spellStart"/>
@@ -5354,6 +7169,7 @@
           <w:szCs w:val="24"/>
           <w:lang w:eastAsia="es-EC"/>
         </w:rPr>
+        <w:lastRenderedPageBreak/>
         <w:t>…</w:t>
       </w:r>
     </w:p>
@@ -5398,6 +7214,1608 @@
         </w:rPr>
         <w:t>…</w:t>
       </w:r>
+    </w:p>
+    <w:p>
+      <w:pPr>
+        <w:spacing w:before="100" w:beforeAutospacing="1" w:after="100" w:afterAutospacing="1" w:line="240" w:lineRule="auto"/>
+        <w:rPr>
+          <w:rFonts w:ascii="Times New Roman" w:eastAsia="Times New Roman" w:hAnsi="Times New Roman" w:cs="Times New Roman"/>
+          <w:sz w:val="24"/>
+          <w:szCs w:val="24"/>
+          <w:lang w:eastAsia="es-EC"/>
+        </w:rPr>
+      </w:pPr>
+    </w:p>
+    <w:p>
+      <w:pPr>
+        <w:spacing w:before="100" w:beforeAutospacing="1" w:after="100" w:afterAutospacing="1" w:line="240" w:lineRule="auto"/>
+        <w:rPr>
+          <w:rFonts w:ascii="Times New Roman" w:eastAsia="Times New Roman" w:hAnsi="Times New Roman" w:cs="Times New Roman"/>
+          <w:b/>
+          <w:bCs/>
+          <w:sz w:val="24"/>
+          <w:szCs w:val="24"/>
+          <w:lang w:eastAsia="es-EC"/>
+        </w:rPr>
+      </w:pPr>
+      <w:r>
+        <w:rPr>
+          <w:rFonts w:ascii="Times New Roman" w:eastAsia="Times New Roman" w:hAnsi="Times New Roman" w:cs="Times New Roman"/>
+          <w:b/>
+          <w:bCs/>
+          <w:sz w:val="24"/>
+          <w:szCs w:val="24"/>
+          <w:lang w:eastAsia="es-EC"/>
+        </w:rPr>
+        <w:t>RECOMENDACIONES DE LA IA</w:t>
+      </w:r>
+    </w:p>
+    <w:tbl>
+      <w:tblPr>
+        <w:tblStyle w:val="Tablaconcuadrcula"/>
+        <w:tblW w:w="0" w:type="auto"/>
+        <w:tblLook w:val="04A0" w:firstRow="1" w:lastRow="0" w:firstColumn="1" w:lastColumn="0" w:noHBand="0" w:noVBand="1"/>
+      </w:tblPr>
+      <w:tblGrid>
+        <w:gridCol w:w="2216"/>
+        <w:gridCol w:w="6800"/>
+      </w:tblGrid>
+      <w:tr>
+        <w:tc>
+          <w:tcPr>
+            <w:tcW w:w="0" w:type="auto"/>
+            <w:hideMark/>
+          </w:tcPr>
+          <w:p>
+            <w:pPr>
+              <w:spacing w:before="100" w:beforeAutospacing="1" w:after="100" w:afterAutospacing="1"/>
+              <w:jc w:val="center"/>
+              <w:rPr>
+                <w:rFonts w:ascii="Times New Roman" w:eastAsia="Times New Roman" w:hAnsi="Times New Roman" w:cs="Times New Roman"/>
+                <w:b/>
+                <w:bCs/>
+                <w:sz w:val="24"/>
+                <w:szCs w:val="24"/>
+                <w:lang w:eastAsia="es-EC"/>
+              </w:rPr>
+            </w:pPr>
+            <w:r>
+              <w:rPr>
+                <w:rFonts w:ascii="Times New Roman" w:eastAsia="Times New Roman" w:hAnsi="Times New Roman" w:cs="Times New Roman"/>
+                <w:b/>
+                <w:bCs/>
+                <w:sz w:val="24"/>
+                <w:szCs w:val="24"/>
+                <w:lang w:eastAsia="es-EC"/>
+              </w:rPr>
+              <w:t>Apartado</w:t>
+            </w:r>
+          </w:p>
+        </w:tc>
+        <w:tc>
+          <w:tcPr>
+            <w:tcW w:w="0" w:type="auto"/>
+            <w:hideMark/>
+          </w:tcPr>
+          <w:p>
+            <w:pPr>
+              <w:spacing w:before="100" w:beforeAutospacing="1" w:after="100" w:afterAutospacing="1"/>
+              <w:jc w:val="center"/>
+              <w:rPr>
+                <w:rFonts w:ascii="Times New Roman" w:eastAsia="Times New Roman" w:hAnsi="Times New Roman" w:cs="Times New Roman"/>
+                <w:b/>
+                <w:bCs/>
+                <w:sz w:val="24"/>
+                <w:szCs w:val="24"/>
+                <w:lang w:eastAsia="es-EC"/>
+              </w:rPr>
+            </w:pPr>
+            <w:r>
+              <w:rPr>
+                <w:rFonts w:ascii="Times New Roman" w:eastAsia="Times New Roman" w:hAnsi="Times New Roman" w:cs="Times New Roman"/>
+                <w:b/>
+                <w:bCs/>
+                <w:sz w:val="24"/>
+                <w:szCs w:val="24"/>
+                <w:lang w:eastAsia="es-EC"/>
+              </w:rPr>
+              <w:t>Decisión</w:t>
+            </w:r>
+          </w:p>
+        </w:tc>
+      </w:tr>
+      <w:tr>
+        <w:tc>
+          <w:tcPr>
+            <w:tcW w:w="0" w:type="auto"/>
+            <w:hideMark/>
+          </w:tcPr>
+          <w:p>
+            <w:pPr>
+              <w:spacing w:before="100" w:beforeAutospacing="1" w:after="100" w:afterAutospacing="1"/>
+              <w:rPr>
+                <w:rFonts w:ascii="Times New Roman" w:eastAsia="Times New Roman" w:hAnsi="Times New Roman" w:cs="Times New Roman"/>
+                <w:sz w:val="24"/>
+                <w:szCs w:val="24"/>
+                <w:lang w:eastAsia="es-EC"/>
+              </w:rPr>
+            </w:pPr>
+            <w:r>
+              <w:rPr>
+                <w:rFonts w:ascii="Times New Roman" w:eastAsia="Times New Roman" w:hAnsi="Times New Roman" w:cs="Times New Roman"/>
+                <w:sz w:val="24"/>
+                <w:szCs w:val="24"/>
+                <w:lang w:eastAsia="es-EC"/>
+              </w:rPr>
+              <w:t>Recomendación aceptada</w:t>
+            </w:r>
+          </w:p>
+        </w:tc>
+        <w:tc>
+          <w:tcPr>
+            <w:tcW w:w="0" w:type="auto"/>
+            <w:hideMark/>
+          </w:tcPr>
+          <w:p>
+            <w:pPr>
+              <w:spacing w:before="100" w:beforeAutospacing="1" w:after="100" w:afterAutospacing="1"/>
+              <w:rPr>
+                <w:rFonts w:ascii="Times New Roman" w:eastAsia="Times New Roman" w:hAnsi="Times New Roman" w:cs="Times New Roman"/>
+                <w:sz w:val="24"/>
+                <w:szCs w:val="24"/>
+                <w:lang w:eastAsia="es-EC"/>
+              </w:rPr>
+            </w:pPr>
+            <w:r>
+              <w:rPr>
+                <w:rFonts w:ascii="Times New Roman" w:eastAsia="Times New Roman" w:hAnsi="Times New Roman" w:cs="Times New Roman"/>
+                <w:sz w:val="24"/>
+                <w:szCs w:val="24"/>
+                <w:lang w:eastAsia="es-EC"/>
+              </w:rPr>
+              <w:t>Utilizar una única clase producto (</w:t>
+            </w:r>
+            <w:proofErr w:type="spellStart"/>
+            <w:r>
+              <w:rPr>
+                <w:rFonts w:ascii="Times New Roman" w:eastAsia="Times New Roman" w:hAnsi="Times New Roman" w:cs="Times New Roman"/>
+                <w:sz w:val="24"/>
+                <w:szCs w:val="24"/>
+                <w:lang w:eastAsia="es-EC"/>
+              </w:rPr>
+              <w:t>ActivoFijo</w:t>
+            </w:r>
+            <w:proofErr w:type="spellEnd"/>
+            <w:r>
+              <w:rPr>
+                <w:rFonts w:ascii="Times New Roman" w:eastAsia="Times New Roman" w:hAnsi="Times New Roman" w:cs="Times New Roman"/>
+                <w:sz w:val="24"/>
+                <w:szCs w:val="24"/>
+                <w:lang w:eastAsia="es-EC"/>
+              </w:rPr>
+              <w:t>), sin crear una jerarquía de productos para computadoras, impresoras, muebles y vehículos</w:t>
+            </w:r>
+          </w:p>
+        </w:tc>
+      </w:tr>
+      <w:tr>
+        <w:tc>
+          <w:tcPr>
+            <w:tcW w:w="0" w:type="auto"/>
+            <w:hideMark/>
+          </w:tcPr>
+          <w:p>
+            <w:pPr>
+              <w:spacing w:before="100" w:beforeAutospacing="1" w:after="100" w:afterAutospacing="1"/>
+              <w:rPr>
+                <w:rFonts w:ascii="Times New Roman" w:eastAsia="Times New Roman" w:hAnsi="Times New Roman" w:cs="Times New Roman"/>
+                <w:sz w:val="24"/>
+                <w:szCs w:val="24"/>
+                <w:lang w:eastAsia="es-EC"/>
+              </w:rPr>
+            </w:pPr>
+            <w:r>
+              <w:rPr>
+                <w:rFonts w:ascii="Times New Roman" w:eastAsia="Times New Roman" w:hAnsi="Times New Roman" w:cs="Times New Roman"/>
+                <w:sz w:val="24"/>
+                <w:szCs w:val="24"/>
+                <w:lang w:eastAsia="es-EC"/>
+              </w:rPr>
+              <w:t>Recomendación modificada</w:t>
+            </w:r>
+          </w:p>
+        </w:tc>
+        <w:tc>
+          <w:tcPr>
+            <w:tcW w:w="0" w:type="auto"/>
+            <w:hideMark/>
+          </w:tcPr>
+          <w:p>
+            <w:pPr>
+              <w:spacing w:before="100" w:beforeAutospacing="1" w:after="100" w:afterAutospacing="1"/>
+              <w:rPr>
+                <w:rFonts w:ascii="Times New Roman" w:eastAsia="Times New Roman" w:hAnsi="Times New Roman" w:cs="Times New Roman"/>
+                <w:sz w:val="24"/>
+                <w:szCs w:val="24"/>
+                <w:lang w:eastAsia="es-EC"/>
+              </w:rPr>
+            </w:pPr>
+            <w:r>
+              <w:rPr>
+                <w:rFonts w:ascii="Times New Roman" w:eastAsia="Times New Roman" w:hAnsi="Times New Roman" w:cs="Times New Roman"/>
+                <w:sz w:val="24"/>
+                <w:szCs w:val="24"/>
+                <w:lang w:eastAsia="es-EC"/>
+              </w:rPr>
+              <w:t>Modificar</w:t>
+            </w:r>
+            <w:r>
+              <w:rPr>
+                <w:rFonts w:ascii="Times New Roman" w:eastAsia="Times New Roman" w:hAnsi="Times New Roman" w:cs="Times New Roman"/>
+                <w:sz w:val="24"/>
+                <w:szCs w:val="24"/>
+                <w:lang w:eastAsia="es-EC"/>
+              </w:rPr>
+              <w:t xml:space="preserve"> el atributo </w:t>
+            </w:r>
+            <w:proofErr w:type="spellStart"/>
+            <w:r>
+              <w:rPr>
+                <w:rFonts w:ascii="Times New Roman" w:eastAsia="Times New Roman" w:hAnsi="Times New Roman" w:cs="Times New Roman"/>
+                <w:sz w:val="24"/>
+                <w:szCs w:val="24"/>
+                <w:lang w:eastAsia="es-EC"/>
+              </w:rPr>
+              <w:t>caracteristicasTecnicas</w:t>
+            </w:r>
+            <w:proofErr w:type="spellEnd"/>
+            <w:r>
+              <w:rPr>
+                <w:rFonts w:ascii="Times New Roman" w:eastAsia="Times New Roman" w:hAnsi="Times New Roman" w:cs="Times New Roman"/>
+                <w:sz w:val="24"/>
+                <w:szCs w:val="24"/>
+                <w:lang w:eastAsia="es-EC"/>
+              </w:rPr>
+              <w:t xml:space="preserve">: </w:t>
+            </w:r>
+            <w:proofErr w:type="spellStart"/>
+            <w:r>
+              <w:rPr>
+                <w:rFonts w:ascii="Times New Roman" w:eastAsia="Times New Roman" w:hAnsi="Times New Roman" w:cs="Times New Roman"/>
+                <w:sz w:val="24"/>
+                <w:szCs w:val="24"/>
+                <w:lang w:eastAsia="es-EC"/>
+              </w:rPr>
+              <w:t>Map</w:t>
+            </w:r>
+            <w:proofErr w:type="spellEnd"/>
+            <w:r>
+              <w:rPr>
+                <w:rFonts w:ascii="Times New Roman" w:eastAsia="Times New Roman" w:hAnsi="Times New Roman" w:cs="Times New Roman"/>
+                <w:sz w:val="24"/>
+                <w:szCs w:val="24"/>
+                <w:lang w:eastAsia="es-EC"/>
+              </w:rPr>
+              <w:t>&lt;</w:t>
+            </w:r>
+            <w:proofErr w:type="spellStart"/>
+            <w:r>
+              <w:rPr>
+                <w:rFonts w:ascii="Times New Roman" w:eastAsia="Times New Roman" w:hAnsi="Times New Roman" w:cs="Times New Roman"/>
+                <w:sz w:val="24"/>
+                <w:szCs w:val="24"/>
+                <w:lang w:eastAsia="es-EC"/>
+              </w:rPr>
+              <w:t>String</w:t>
+            </w:r>
+            <w:proofErr w:type="spellEnd"/>
+            <w:r>
+              <w:rPr>
+                <w:rFonts w:ascii="Times New Roman" w:eastAsia="Times New Roman" w:hAnsi="Times New Roman" w:cs="Times New Roman"/>
+                <w:sz w:val="24"/>
+                <w:szCs w:val="24"/>
+                <w:lang w:eastAsia="es-EC"/>
+              </w:rPr>
+              <w:t xml:space="preserve">, </w:t>
+            </w:r>
+            <w:proofErr w:type="spellStart"/>
+            <w:r>
+              <w:rPr>
+                <w:rFonts w:ascii="Times New Roman" w:eastAsia="Times New Roman" w:hAnsi="Times New Roman" w:cs="Times New Roman"/>
+                <w:sz w:val="24"/>
+                <w:szCs w:val="24"/>
+                <w:lang w:eastAsia="es-EC"/>
+              </w:rPr>
+              <w:t>String</w:t>
+            </w:r>
+            <w:proofErr w:type="spellEnd"/>
+            <w:r>
+              <w:rPr>
+                <w:rFonts w:ascii="Times New Roman" w:eastAsia="Times New Roman" w:hAnsi="Times New Roman" w:cs="Times New Roman"/>
+                <w:sz w:val="24"/>
+                <w:szCs w:val="24"/>
+                <w:lang w:eastAsia="es-EC"/>
+              </w:rPr>
+              <w:t xml:space="preserve">&gt; </w:t>
+            </w:r>
+            <w:r>
+              <w:rPr>
+                <w:rFonts w:ascii="Times New Roman" w:eastAsia="Times New Roman" w:hAnsi="Times New Roman" w:cs="Times New Roman"/>
+                <w:sz w:val="24"/>
+                <w:szCs w:val="24"/>
+                <w:lang w:eastAsia="es-EC"/>
+              </w:rPr>
+              <w:t xml:space="preserve">para </w:t>
+            </w:r>
+            <w:r>
+              <w:rPr>
+                <w:rFonts w:ascii="Times New Roman" w:eastAsia="Times New Roman" w:hAnsi="Times New Roman" w:cs="Times New Roman"/>
+                <w:sz w:val="24"/>
+                <w:szCs w:val="24"/>
+                <w:lang w:eastAsia="es-EC"/>
+              </w:rPr>
+              <w:t xml:space="preserve">almacenar diferentes </w:t>
+            </w:r>
+            <w:proofErr w:type="spellStart"/>
+            <w:r>
+              <w:rPr>
+                <w:rFonts w:ascii="Times New Roman" w:eastAsia="Times New Roman" w:hAnsi="Times New Roman" w:cs="Times New Roman"/>
+                <w:sz w:val="24"/>
+                <w:szCs w:val="24"/>
+                <w:lang w:eastAsia="es-EC"/>
+              </w:rPr>
+              <w:t>caracteristicas</w:t>
+            </w:r>
+            <w:proofErr w:type="spellEnd"/>
+            <w:r>
+              <w:rPr>
+                <w:rFonts w:ascii="Times New Roman" w:eastAsia="Times New Roman" w:hAnsi="Times New Roman" w:cs="Times New Roman"/>
+                <w:sz w:val="24"/>
+                <w:szCs w:val="24"/>
+                <w:lang w:eastAsia="es-EC"/>
+              </w:rPr>
+              <w:t>.</w:t>
+            </w:r>
+          </w:p>
+        </w:tc>
+      </w:tr>
+    </w:tbl>
+    <w:p>
+      <w:pPr>
+        <w:spacing w:before="100" w:beforeAutospacing="1" w:after="100" w:afterAutospacing="1" w:line="240" w:lineRule="auto"/>
+        <w:rPr>
+          <w:rFonts w:ascii="Times New Roman" w:eastAsia="Times New Roman" w:hAnsi="Times New Roman" w:cs="Times New Roman"/>
+          <w:sz w:val="24"/>
+          <w:szCs w:val="24"/>
+          <w:lang w:eastAsia="es-EC"/>
+        </w:rPr>
+      </w:pPr>
+    </w:p>
+    <w:p>
+      <w:pPr>
+        <w:spacing w:before="100" w:beforeAutospacing="1" w:after="100" w:afterAutospacing="1" w:line="240" w:lineRule="auto"/>
+        <w:jc w:val="both"/>
+        <w:rPr>
+          <w:rFonts w:ascii="Times New Roman" w:eastAsia="Times New Roman" w:hAnsi="Times New Roman" w:cs="Times New Roman"/>
+          <w:sz w:val="24"/>
+          <w:szCs w:val="24"/>
+          <w:lang w:eastAsia="es-EC"/>
+        </w:rPr>
+      </w:pPr>
+      <w:r>
+        <w:rPr>
+          <w:rFonts w:ascii="Times New Roman" w:eastAsia="Times New Roman" w:hAnsi="Times New Roman" w:cs="Times New Roman"/>
+          <w:sz w:val="24"/>
+          <w:szCs w:val="24"/>
+          <w:lang w:eastAsia="es-EC"/>
+        </w:rPr>
+        <w:t xml:space="preserve">Se acepta la recomendación de la IA de utilizar únicamente la clase </w:t>
+      </w:r>
+      <w:proofErr w:type="spellStart"/>
+      <w:r>
+        <w:rPr>
+          <w:rFonts w:ascii="Times New Roman" w:eastAsia="Times New Roman" w:hAnsi="Times New Roman" w:cs="Times New Roman"/>
+          <w:sz w:val="24"/>
+          <w:szCs w:val="24"/>
+          <w:lang w:eastAsia="es-EC"/>
+        </w:rPr>
+        <w:t>ActivoFijo</w:t>
+      </w:r>
+      <w:proofErr w:type="spellEnd"/>
+      <w:r>
+        <w:rPr>
+          <w:rFonts w:ascii="Times New Roman" w:eastAsia="Times New Roman" w:hAnsi="Times New Roman" w:cs="Times New Roman"/>
+          <w:sz w:val="24"/>
+          <w:szCs w:val="24"/>
+          <w:lang w:eastAsia="es-EC"/>
+        </w:rPr>
+        <w:t xml:space="preserve"> para representar los diferentes bienes institucionales, sin crear clases independientes para computadores, impresoras, muebles o vehículos.  Esta decisión nos permite manejar los distintos activos mediante una misma estructura, configurando únicamente los atributos necesarios para cada uno.</w:t>
+      </w:r>
+    </w:p>
+    <w:p>
+      <w:pPr>
+        <w:spacing w:before="100" w:beforeAutospacing="1" w:after="100" w:afterAutospacing="1" w:line="240" w:lineRule="auto"/>
+        <w:rPr>
+          <w:rFonts w:ascii="Times New Roman" w:eastAsia="Times New Roman" w:hAnsi="Times New Roman" w:cs="Times New Roman"/>
+          <w:sz w:val="24"/>
+          <w:szCs w:val="24"/>
+          <w:lang w:eastAsia="es-EC"/>
+        </w:rPr>
+      </w:pPr>
+      <w:r>
+        <w:rPr>
+          <w:rFonts w:ascii="Times New Roman" w:eastAsia="Times New Roman" w:hAnsi="Times New Roman" w:cs="Times New Roman"/>
+          <w:sz w:val="24"/>
+          <w:szCs w:val="24"/>
+          <w:lang w:eastAsia="es-EC"/>
+        </w:rPr>
+        <w:t xml:space="preserve">Se modifica el atributo </w:t>
+      </w:r>
+      <w:proofErr w:type="spellStart"/>
+      <w:r>
+        <w:rPr>
+          <w:rFonts w:ascii="Times New Roman" w:eastAsia="Times New Roman" w:hAnsi="Times New Roman" w:cs="Times New Roman"/>
+          <w:sz w:val="24"/>
+          <w:szCs w:val="24"/>
+          <w:lang w:eastAsia="es-EC"/>
+        </w:rPr>
+        <w:t>caracteristicasTecnicas</w:t>
+      </w:r>
+      <w:proofErr w:type="spellEnd"/>
+      <w:r>
+        <w:rPr>
+          <w:rFonts w:ascii="Times New Roman" w:eastAsia="Times New Roman" w:hAnsi="Times New Roman" w:cs="Times New Roman"/>
+          <w:sz w:val="24"/>
+          <w:szCs w:val="24"/>
+          <w:lang w:eastAsia="es-EC"/>
+        </w:rPr>
+        <w:t xml:space="preserve">, de tipo </w:t>
+      </w:r>
+      <w:proofErr w:type="spellStart"/>
+      <w:r>
+        <w:rPr>
+          <w:rFonts w:ascii="Times New Roman" w:eastAsia="Times New Roman" w:hAnsi="Times New Roman" w:cs="Times New Roman"/>
+          <w:sz w:val="24"/>
+          <w:szCs w:val="24"/>
+          <w:lang w:eastAsia="es-EC"/>
+        </w:rPr>
+        <w:t>String</w:t>
+      </w:r>
+      <w:proofErr w:type="spellEnd"/>
+      <w:r>
+        <w:rPr>
+          <w:rFonts w:ascii="Times New Roman" w:eastAsia="Times New Roman" w:hAnsi="Times New Roman" w:cs="Times New Roman"/>
+          <w:sz w:val="24"/>
+          <w:szCs w:val="24"/>
+          <w:lang w:eastAsia="es-EC"/>
+        </w:rPr>
+        <w:t xml:space="preserve"> a un tipo </w:t>
+      </w:r>
+      <w:proofErr w:type="spellStart"/>
+      <w:r>
+        <w:rPr>
+          <w:rFonts w:ascii="Times New Roman" w:eastAsia="Times New Roman" w:hAnsi="Times New Roman" w:cs="Times New Roman"/>
+          <w:sz w:val="24"/>
+          <w:szCs w:val="24"/>
+          <w:lang w:eastAsia="es-EC"/>
+        </w:rPr>
+        <w:t>Map</w:t>
+      </w:r>
+      <w:proofErr w:type="spellEnd"/>
+      <w:r>
+        <w:rPr>
+          <w:rFonts w:ascii="Times New Roman" w:eastAsia="Times New Roman" w:hAnsi="Times New Roman" w:cs="Times New Roman"/>
+          <w:sz w:val="24"/>
+          <w:szCs w:val="24"/>
+          <w:lang w:eastAsia="es-EC"/>
+        </w:rPr>
+        <w:t>, debido que se considera más adecuado utilizar una estructura que permita almacenar diferentes características técnicas con el objetivo de registrar información más organizada y flexible, sin necesidad de crear atributos específicos para cada tipo de activo.</w:t>
+      </w:r>
+    </w:p>
+    <w:p>
+      <w:pPr>
+        <w:jc w:val="both"/>
+        <w:rPr>
+          <w:rFonts w:ascii="Times New Roman" w:eastAsia="Times New Roman" w:hAnsi="Times New Roman" w:cs="Times New Roman"/>
+          <w:sz w:val="24"/>
+          <w:szCs w:val="24"/>
+          <w:lang w:eastAsia="es-EC"/>
+        </w:rPr>
+      </w:pPr>
+    </w:p>
+    <w:p>
+      <w:pPr>
+        <w:jc w:val="both"/>
+        <w:rPr>
+          <w:rFonts w:ascii="Times New Roman" w:eastAsia="Times New Roman" w:hAnsi="Times New Roman" w:cs="Times New Roman"/>
+          <w:b/>
+          <w:bCs/>
+          <w:sz w:val="24"/>
+          <w:szCs w:val="24"/>
+          <w:lang w:eastAsia="es-EC"/>
+        </w:rPr>
+      </w:pPr>
+      <w:r>
+        <w:rPr>
+          <w:rFonts w:ascii="Times New Roman" w:eastAsia="Times New Roman" w:hAnsi="Times New Roman" w:cs="Times New Roman"/>
+          <w:b/>
+          <w:bCs/>
+          <w:sz w:val="24"/>
+          <w:szCs w:val="24"/>
+          <w:lang w:eastAsia="es-EC"/>
+        </w:rPr>
+        <w:t>Ajustes realizados durante la implementación (Escenario 2):</w:t>
+      </w:r>
+    </w:p>
+    <w:tbl>
+      <w:tblPr>
+        <w:tblStyle w:val="Tablaconcuadrcula"/>
+        <w:tblW w:w="9067" w:type="dxa"/>
+        <w:tblLook w:val="04A0" w:firstRow="1" w:lastRow="0" w:firstColumn="1" w:lastColumn="0" w:noHBand="0" w:noVBand="1"/>
+      </w:tblPr>
+      <w:tblGrid>
+        <w:gridCol w:w="3900"/>
+        <w:gridCol w:w="5167"/>
+      </w:tblGrid>
+      <w:tr>
+        <w:tc>
+          <w:tcPr>
+            <w:tcW w:w="3900" w:type="dxa"/>
+          </w:tcPr>
+          <w:p>
+            <w:pPr>
+              <w:spacing w:before="100" w:beforeAutospacing="1" w:after="100" w:afterAutospacing="1"/>
+              <w:jc w:val="both"/>
+              <w:rPr>
+                <w:rFonts w:ascii="Times New Roman" w:eastAsia="Times New Roman" w:hAnsi="Times New Roman" w:cs="Times New Roman"/>
+                <w:b/>
+                <w:bCs/>
+                <w:sz w:val="24"/>
+                <w:szCs w:val="24"/>
+                <w:lang w:eastAsia="es-EC"/>
+              </w:rPr>
+            </w:pPr>
+            <w:r>
+              <w:rPr>
+                <w:rFonts w:ascii="Times New Roman" w:eastAsia="Times New Roman" w:hAnsi="Times New Roman" w:cs="Times New Roman"/>
+                <w:b/>
+                <w:bCs/>
+                <w:sz w:val="24"/>
+                <w:szCs w:val="24"/>
+                <w:lang w:eastAsia="es-EC"/>
+              </w:rPr>
+              <w:t>Cambio</w:t>
+            </w:r>
+          </w:p>
+        </w:tc>
+        <w:tc>
+          <w:tcPr>
+            <w:tcW w:w="5167" w:type="dxa"/>
+          </w:tcPr>
+          <w:p>
+            <w:pPr>
+              <w:spacing w:before="100" w:beforeAutospacing="1" w:after="100" w:afterAutospacing="1"/>
+              <w:jc w:val="both"/>
+              <w:rPr>
+                <w:rFonts w:ascii="Times New Roman" w:eastAsia="Times New Roman" w:hAnsi="Times New Roman" w:cs="Times New Roman"/>
+                <w:b/>
+                <w:bCs/>
+                <w:sz w:val="24"/>
+                <w:szCs w:val="24"/>
+                <w:lang w:eastAsia="es-EC"/>
+              </w:rPr>
+            </w:pPr>
+            <w:r>
+              <w:rPr>
+                <w:rFonts w:ascii="Times New Roman" w:eastAsia="Times New Roman" w:hAnsi="Times New Roman" w:cs="Times New Roman"/>
+                <w:b/>
+                <w:bCs/>
+                <w:sz w:val="24"/>
+                <w:szCs w:val="24"/>
+                <w:lang w:eastAsia="es-EC"/>
+              </w:rPr>
+              <w:t>Justificación</w:t>
+            </w:r>
+          </w:p>
+        </w:tc>
+      </w:tr>
+      <w:tr>
+        <w:tc>
+          <w:tcPr>
+            <w:tcW w:w="3900" w:type="dxa"/>
+          </w:tcPr>
+          <w:p>
+            <w:pPr>
+              <w:spacing w:before="100" w:beforeAutospacing="1" w:after="100" w:afterAutospacing="1"/>
+              <w:jc w:val="both"/>
+              <w:rPr>
+                <w:rFonts w:ascii="Times New Roman" w:eastAsia="Times New Roman" w:hAnsi="Times New Roman" w:cs="Times New Roman"/>
+                <w:sz w:val="24"/>
+                <w:szCs w:val="24"/>
+                <w:lang w:eastAsia="es-EC"/>
+              </w:rPr>
+            </w:pPr>
+            <w:r>
+              <w:rPr>
+                <w:rFonts w:ascii="Times New Roman" w:eastAsia="Times New Roman" w:hAnsi="Times New Roman" w:cs="Times New Roman"/>
+                <w:sz w:val="24"/>
+                <w:szCs w:val="24"/>
+                <w:lang w:eastAsia="es-EC"/>
+              </w:rPr>
+              <w:t>ActivoFijo se implementó como clase inmutable (campos final, constructor de paquete, sin setters) y el Map de características se copia y se hace no modificable.</w:t>
+            </w:r>
+          </w:p>
+        </w:tc>
+        <w:tc>
+          <w:tcPr>
+            <w:tcW w:w="5167" w:type="dxa"/>
+          </w:tcPr>
+          <w:p>
+            <w:pPr>
+              <w:spacing w:before="100" w:beforeAutospacing="1" w:after="100" w:afterAutospacing="1"/>
+              <w:jc w:val="both"/>
+              <w:rPr>
+                <w:rFonts w:ascii="Times New Roman" w:eastAsia="Times New Roman" w:hAnsi="Times New Roman" w:cs="Times New Roman"/>
+                <w:sz w:val="24"/>
+                <w:szCs w:val="24"/>
+                <w:lang w:eastAsia="es-EC"/>
+              </w:rPr>
+            </w:pPr>
+            <w:r>
+              <w:rPr>
+                <w:rFonts w:ascii="Times New Roman" w:eastAsia="Times New Roman" w:hAnsi="Times New Roman" w:cs="Times New Roman"/>
+                <w:sz w:val="24"/>
+                <w:szCs w:val="24"/>
+                <w:lang w:eastAsia="es-EC"/>
+              </w:rPr>
+              <w:t>Garantiza que un activo, una vez construido y validado, no pueda quedar inválido ni modificarse</w:t>
+            </w:r>
+            <w:r>
+              <w:rPr>
+                <w:rFonts w:ascii="Times New Roman" w:eastAsia="Times New Roman" w:hAnsi="Times New Roman" w:cs="Times New Roman"/>
+                <w:sz w:val="24"/>
+                <w:szCs w:val="24"/>
+                <w:lang w:eastAsia="es-EC"/>
+              </w:rPr>
+              <w:t xml:space="preserve"> por accidente.</w:t>
+            </w:r>
+          </w:p>
+        </w:tc>
+      </w:tr>
+      <w:tr>
+        <w:tc>
+          <w:tcPr>
+            <w:tcW w:w="3900" w:type="dxa"/>
+          </w:tcPr>
+          <w:p>
+            <w:pPr>
+              <w:spacing w:before="100" w:beforeAutospacing="1" w:after="100" w:afterAutospacing="1"/>
+              <w:jc w:val="both"/>
+              <w:rPr>
+                <w:rFonts w:ascii="Times New Roman" w:eastAsia="Times New Roman" w:hAnsi="Times New Roman" w:cs="Times New Roman"/>
+                <w:sz w:val="24"/>
+                <w:szCs w:val="24"/>
+                <w:lang w:eastAsia="es-EC"/>
+              </w:rPr>
+            </w:pPr>
+            <w:r>
+              <w:rPr>
+                <w:rFonts w:ascii="Times New Roman" w:eastAsia="Times New Roman" w:hAnsi="Times New Roman" w:cs="Times New Roman"/>
+                <w:sz w:val="24"/>
+                <w:szCs w:val="24"/>
+                <w:lang w:eastAsia="es-EC"/>
+              </w:rPr>
+              <w:t>ConstructorActivoFijo guarda los datos en campos temporales en lugar del atributo activo: ActivoFijo.</w:t>
+            </w:r>
+          </w:p>
+        </w:tc>
+        <w:tc>
+          <w:tcPr>
+            <w:tcW w:w="5167" w:type="dxa"/>
+          </w:tcPr>
+          <w:p>
+            <w:pPr>
+              <w:spacing w:before="100" w:beforeAutospacing="1" w:after="100" w:afterAutospacing="1"/>
+              <w:jc w:val="both"/>
+              <w:rPr>
+                <w:rFonts w:ascii="Times New Roman" w:eastAsia="Times New Roman" w:hAnsi="Times New Roman" w:cs="Times New Roman"/>
+                <w:sz w:val="24"/>
+                <w:szCs w:val="24"/>
+                <w:lang w:eastAsia="es-EC"/>
+              </w:rPr>
+            </w:pPr>
+            <w:r>
+              <w:rPr>
+                <w:rFonts w:ascii="Times New Roman" w:eastAsia="Times New Roman" w:hAnsi="Times New Roman" w:cs="Times New Roman"/>
+                <w:sz w:val="24"/>
+                <w:szCs w:val="24"/>
+                <w:lang w:eastAsia="es-EC"/>
+              </w:rPr>
+              <w:t>Consecuencia de la inmutabilidad: el producto solo puede crearse cuando todos los datos están completos.</w:t>
+            </w:r>
+          </w:p>
+        </w:tc>
+      </w:tr>
+      <w:tr>
+        <w:tc>
+          <w:tcPr>
+            <w:tcW w:w="3900" w:type="dxa"/>
+          </w:tcPr>
+          <w:p>
+            <w:pPr>
+              <w:spacing w:before="100" w:beforeAutospacing="1" w:after="100" w:afterAutospacing="1"/>
+              <w:jc w:val="both"/>
+              <w:rPr>
+                <w:rFonts w:ascii="Times New Roman" w:eastAsia="Times New Roman" w:hAnsi="Times New Roman" w:cs="Times New Roman"/>
+                <w:sz w:val="24"/>
+                <w:szCs w:val="24"/>
+                <w:lang w:eastAsia="es-EC"/>
+              </w:rPr>
+            </w:pPr>
+            <w:r>
+              <w:rPr>
+                <w:rFonts w:ascii="Times New Roman" w:eastAsia="Times New Roman" w:hAnsi="Times New Roman" w:cs="Times New Roman"/>
+                <w:sz w:val="24"/>
+                <w:szCs w:val="24"/>
+                <w:lang w:eastAsia="es-EC"/>
+              </w:rPr>
+              <w:t>La relación ConstructorActivoFi</w:t>
+            </w:r>
+            <w:r>
+              <w:rPr>
+                <w:rFonts w:ascii="Times New Roman" w:eastAsia="Times New Roman" w:hAnsi="Times New Roman" w:cs="Times New Roman"/>
+                <w:sz w:val="24"/>
+                <w:szCs w:val="24"/>
+                <w:lang w:eastAsia="es-EC"/>
+              </w:rPr>
+              <w:t>jo --&gt; ActivoFijo : construye se cambia por una dependencia ConstructorActivoFijo ..&gt; ActivoFijo : &lt;&lt;create&gt;&gt;.</w:t>
+            </w:r>
+          </w:p>
+        </w:tc>
+        <w:tc>
+          <w:tcPr>
+            <w:tcW w:w="5167" w:type="dxa"/>
+          </w:tcPr>
+          <w:p>
+            <w:pPr>
+              <w:spacing w:before="100" w:beforeAutospacing="1" w:after="100" w:afterAutospacing="1"/>
+              <w:jc w:val="both"/>
+              <w:rPr>
+                <w:rFonts w:ascii="Times New Roman" w:eastAsia="Times New Roman" w:hAnsi="Times New Roman" w:cs="Times New Roman"/>
+                <w:sz w:val="24"/>
+                <w:szCs w:val="24"/>
+                <w:lang w:eastAsia="es-EC"/>
+              </w:rPr>
+            </w:pPr>
+            <w:r>
+              <w:rPr>
+                <w:rFonts w:ascii="Times New Roman" w:eastAsia="Times New Roman" w:hAnsi="Times New Roman" w:cs="Times New Roman"/>
+                <w:sz w:val="24"/>
+                <w:szCs w:val="24"/>
+                <w:lang w:eastAsia="es-EC"/>
+              </w:rPr>
+              <w:t>El builder no conserva al producto como atributo; solo lo crea en obtenerActivo(). Una asociación implicaría lo contrario.</w:t>
+            </w:r>
+          </w:p>
+        </w:tc>
+      </w:tr>
+      <w:tr>
+        <w:tc>
+          <w:tcPr>
+            <w:tcW w:w="3900" w:type="dxa"/>
+          </w:tcPr>
+          <w:p>
+            <w:pPr>
+              <w:spacing w:before="100" w:beforeAutospacing="1" w:after="100" w:afterAutospacing="1"/>
+              <w:jc w:val="both"/>
+              <w:rPr>
+                <w:rFonts w:ascii="Times New Roman" w:eastAsia="Times New Roman" w:hAnsi="Times New Roman" w:cs="Times New Roman"/>
+                <w:sz w:val="24"/>
+                <w:szCs w:val="24"/>
+                <w:lang w:eastAsia="es-EC"/>
+              </w:rPr>
+            </w:pPr>
+            <w:r>
+              <w:rPr>
+                <w:rFonts w:ascii="Times New Roman" w:eastAsia="Times New Roman" w:hAnsi="Times New Roman" w:cs="Times New Roman"/>
+                <w:sz w:val="24"/>
+                <w:szCs w:val="24"/>
+                <w:lang w:eastAsia="es-EC"/>
+              </w:rPr>
+              <w:t>Se agregaron las mult</w:t>
+            </w:r>
+            <w:r>
+              <w:rPr>
+                <w:rFonts w:ascii="Times New Roman" w:eastAsia="Times New Roman" w:hAnsi="Times New Roman" w:cs="Times New Roman"/>
+                <w:sz w:val="24"/>
+                <w:szCs w:val="24"/>
+                <w:lang w:eastAsia="es-EC"/>
+              </w:rPr>
+              <w:t xml:space="preserve">iplicidades * en DirectorActivoFijo (hacia </w:t>
+            </w:r>
+            <w:r>
+              <w:rPr>
+                <w:rFonts w:ascii="Times New Roman" w:eastAsia="Times New Roman" w:hAnsi="Times New Roman" w:cs="Times New Roman"/>
+                <w:sz w:val="24"/>
+                <w:szCs w:val="24"/>
+                <w:lang w:eastAsia="es-EC"/>
+              </w:rPr>
+              <w:lastRenderedPageBreak/>
+              <w:t>ActivoFijoBuilder, con 1) y * en ConstructorActivoFijo (hacia ActivoFijo, con 1).</w:t>
+            </w:r>
+          </w:p>
+        </w:tc>
+        <w:tc>
+          <w:tcPr>
+            <w:tcW w:w="5167" w:type="dxa"/>
+          </w:tcPr>
+          <w:p>
+            <w:pPr>
+              <w:spacing w:before="100" w:beforeAutospacing="1" w:after="100" w:afterAutospacing="1"/>
+              <w:jc w:val="both"/>
+              <w:rPr>
+                <w:rFonts w:ascii="Times New Roman" w:eastAsia="Times New Roman" w:hAnsi="Times New Roman" w:cs="Times New Roman"/>
+                <w:sz w:val="24"/>
+                <w:szCs w:val="24"/>
+                <w:lang w:eastAsia="es-EC"/>
+              </w:rPr>
+            </w:pPr>
+            <w:r>
+              <w:rPr>
+                <w:rFonts w:ascii="Times New Roman" w:eastAsia="Times New Roman" w:hAnsi="Times New Roman" w:cs="Times New Roman"/>
+                <w:sz w:val="24"/>
+                <w:szCs w:val="24"/>
+                <w:lang w:eastAsia="es-EC"/>
+              </w:rPr>
+              <w:lastRenderedPageBreak/>
+              <w:t xml:space="preserve">Se alinea el diagrama con la estructura del patrón Builder del material de la asignatura (Unidad 01, </w:t>
+            </w:r>
+            <w:r>
+              <w:rPr>
+                <w:rFonts w:ascii="Times New Roman" w:eastAsia="Times New Roman" w:hAnsi="Times New Roman" w:cs="Times New Roman"/>
+                <w:sz w:val="24"/>
+                <w:szCs w:val="24"/>
+                <w:lang w:eastAsia="es-EC"/>
+              </w:rPr>
+              <w:lastRenderedPageBreak/>
+              <w:t>sección 03), donde la flecha p</w:t>
+            </w:r>
+            <w:r>
+              <w:rPr>
+                <w:rFonts w:ascii="Times New Roman" w:eastAsia="Times New Roman" w:hAnsi="Times New Roman" w:cs="Times New Roman"/>
+                <w:sz w:val="24"/>
+                <w:szCs w:val="24"/>
+                <w:lang w:eastAsia="es-EC"/>
+              </w:rPr>
+              <w:t>unteada &lt;&lt;create&gt;&gt; va de ConcreteBuilder a Producto.</w:t>
+            </w:r>
+          </w:p>
+        </w:tc>
+      </w:tr>
+      <w:tr>
+        <w:tc>
+          <w:tcPr>
+            <w:tcW w:w="3900" w:type="dxa"/>
+          </w:tcPr>
+          <w:p>
+            <w:pPr>
+              <w:spacing w:before="100" w:beforeAutospacing="1" w:after="100" w:afterAutospacing="1"/>
+              <w:jc w:val="both"/>
+              <w:rPr>
+                <w:rFonts w:ascii="Times New Roman" w:eastAsia="Times New Roman" w:hAnsi="Times New Roman" w:cs="Times New Roman"/>
+                <w:sz w:val="24"/>
+                <w:szCs w:val="24"/>
+                <w:lang w:eastAsia="es-EC"/>
+              </w:rPr>
+            </w:pPr>
+            <w:r>
+              <w:rPr>
+                <w:rFonts w:ascii="Times New Roman" w:eastAsia="Times New Roman" w:hAnsi="Times New Roman" w:cs="Times New Roman"/>
+                <w:sz w:val="24"/>
+                <w:szCs w:val="24"/>
+                <w:lang w:eastAsia="es-EC"/>
+              </w:rPr>
+              <w:t>En el diagrama de ConstructorActivoFijo se listaron los campos temporales (codigo, nombre, precio, tipo, marca, modelo, numeroSerie, ubicacion, custodio, fechaAdquisicion, garantia, proveedor, caracteri</w:t>
+            </w:r>
+            <w:r>
+              <w:rPr>
+                <w:rFonts w:ascii="Times New Roman" w:eastAsia="Times New Roman" w:hAnsi="Times New Roman" w:cs="Times New Roman"/>
+                <w:sz w:val="24"/>
+                <w:szCs w:val="24"/>
+                <w:lang w:eastAsia="es-EC"/>
+              </w:rPr>
+              <w:t>sticas, observaciones) y se actualizó su nota.</w:t>
+            </w:r>
+          </w:p>
+        </w:tc>
+        <w:tc>
+          <w:tcPr>
+            <w:tcW w:w="5167" w:type="dxa"/>
+          </w:tcPr>
+          <w:p>
+            <w:pPr>
+              <w:spacing w:before="100" w:beforeAutospacing="1" w:after="100" w:afterAutospacing="1"/>
+              <w:jc w:val="both"/>
+              <w:rPr>
+                <w:rFonts w:ascii="Times New Roman" w:eastAsia="Times New Roman" w:hAnsi="Times New Roman" w:cs="Times New Roman"/>
+                <w:sz w:val="24"/>
+                <w:szCs w:val="24"/>
+                <w:lang w:eastAsia="es-EC"/>
+              </w:rPr>
+            </w:pPr>
+            <w:r>
+              <w:rPr>
+                <w:rFonts w:ascii="Times New Roman" w:eastAsia="Times New Roman" w:hAnsi="Times New Roman" w:cs="Times New Roman"/>
+                <w:sz w:val="24"/>
+                <w:szCs w:val="24"/>
+                <w:lang w:eastAsia="es-EC"/>
+              </w:rPr>
+              <w:t>El ConcreteBuilder "mantiene la representación que se está construyendo", valida los obligatorios y crea el producto en obtenerActivo().</w:t>
+            </w:r>
+          </w:p>
+        </w:tc>
+      </w:tr>
+      <w:tr>
+        <w:tc>
+          <w:tcPr>
+            <w:tcW w:w="3900" w:type="dxa"/>
+          </w:tcPr>
+          <w:p>
+            <w:pPr>
+              <w:spacing w:before="100" w:beforeAutospacing="1" w:after="100" w:afterAutospacing="1"/>
+              <w:jc w:val="both"/>
+              <w:rPr>
+                <w:rFonts w:ascii="Times New Roman" w:eastAsia="Times New Roman" w:hAnsi="Times New Roman" w:cs="Times New Roman"/>
+                <w:sz w:val="24"/>
+                <w:szCs w:val="24"/>
+                <w:lang w:eastAsia="es-EC"/>
+              </w:rPr>
+            </w:pPr>
+            <w:r>
+              <w:rPr>
+                <w:rFonts w:ascii="Times New Roman" w:eastAsia="Times New Roman" w:hAnsi="Times New Roman" w:cs="Times New Roman"/>
+                <w:sz w:val="24"/>
+                <w:szCs w:val="24"/>
+                <w:lang w:eastAsia="es-EC"/>
+              </w:rPr>
+              <w:t>Decimal se reemplazó por BigDecimal y Date por LocalDate.</w:t>
+            </w:r>
+          </w:p>
+        </w:tc>
+        <w:tc>
+          <w:tcPr>
+            <w:tcW w:w="5167" w:type="dxa"/>
+          </w:tcPr>
+          <w:p>
+            <w:pPr>
+              <w:spacing w:before="100" w:beforeAutospacing="1" w:after="100" w:afterAutospacing="1"/>
+              <w:jc w:val="both"/>
+              <w:rPr>
+                <w:rFonts w:ascii="Times New Roman" w:eastAsia="Times New Roman" w:hAnsi="Times New Roman" w:cs="Times New Roman"/>
+                <w:sz w:val="24"/>
+                <w:szCs w:val="24"/>
+                <w:lang w:eastAsia="es-EC"/>
+              </w:rPr>
+            </w:pPr>
+            <w:r>
+              <w:rPr>
+                <w:rFonts w:ascii="Times New Roman" w:eastAsia="Times New Roman" w:hAnsi="Times New Roman" w:cs="Times New Roman"/>
+                <w:sz w:val="24"/>
+                <w:szCs w:val="24"/>
+                <w:lang w:eastAsia="es-EC"/>
+              </w:rPr>
+              <w:t>Son los tipos</w:t>
+            </w:r>
+            <w:r>
+              <w:rPr>
+                <w:rFonts w:ascii="Times New Roman" w:eastAsia="Times New Roman" w:hAnsi="Times New Roman" w:cs="Times New Roman"/>
+                <w:sz w:val="24"/>
+                <w:szCs w:val="24"/>
+                <w:lang w:eastAsia="es-EC"/>
+              </w:rPr>
+              <w:t xml:space="preserve"> de Java adecuados para valores monetarios y fechas.</w:t>
+            </w:r>
+          </w:p>
+        </w:tc>
+      </w:tr>
+      <w:tr>
+        <w:tc>
+          <w:tcPr>
+            <w:tcW w:w="3900" w:type="dxa"/>
+          </w:tcPr>
+          <w:p>
+            <w:pPr>
+              <w:spacing w:before="100" w:beforeAutospacing="1" w:after="100" w:afterAutospacing="1"/>
+              <w:jc w:val="both"/>
+              <w:rPr>
+                <w:rFonts w:ascii="Times New Roman" w:eastAsia="Times New Roman" w:hAnsi="Times New Roman" w:cs="Times New Roman"/>
+                <w:sz w:val="24"/>
+                <w:szCs w:val="24"/>
+                <w:lang w:eastAsia="es-EC"/>
+              </w:rPr>
+            </w:pPr>
+            <w:r>
+              <w:rPr>
+                <w:rFonts w:ascii="Times New Roman" w:eastAsia="Times New Roman" w:hAnsi="Times New Roman" w:cs="Times New Roman"/>
+                <w:sz w:val="24"/>
+                <w:szCs w:val="24"/>
+                <w:lang w:eastAsia="es-EC"/>
+              </w:rPr>
+              <w:t>obtenerActivo() valida los atributos obligatorios (código, nombre y precio mayor que cero) y lanza IllegalStateException si faltan.</w:t>
+            </w:r>
+          </w:p>
+        </w:tc>
+        <w:tc>
+          <w:tcPr>
+            <w:tcW w:w="5167" w:type="dxa"/>
+          </w:tcPr>
+          <w:p>
+            <w:pPr>
+              <w:spacing w:before="100" w:beforeAutospacing="1" w:after="100" w:afterAutospacing="1"/>
+              <w:jc w:val="both"/>
+              <w:rPr>
+                <w:rFonts w:ascii="Times New Roman" w:eastAsia="Times New Roman" w:hAnsi="Times New Roman" w:cs="Times New Roman"/>
+                <w:sz w:val="24"/>
+                <w:szCs w:val="24"/>
+                <w:lang w:eastAsia="es-EC"/>
+              </w:rPr>
+            </w:pPr>
+            <w:r>
+              <w:rPr>
+                <w:rFonts w:ascii="Times New Roman" w:eastAsia="Times New Roman" w:hAnsi="Times New Roman" w:cs="Times New Roman"/>
+                <w:sz w:val="24"/>
+                <w:szCs w:val="24"/>
+                <w:lang w:eastAsia="es-EC"/>
+              </w:rPr>
+              <w:t>Cumple el requisito de entregar un objeto "correctamente configurado" y de controlar los obligatorios, limitación identifica</w:t>
+            </w:r>
+            <w:r>
+              <w:rPr>
+                <w:rFonts w:ascii="Times New Roman" w:eastAsia="Times New Roman" w:hAnsi="Times New Roman" w:cs="Times New Roman"/>
+                <w:sz w:val="24"/>
+                <w:szCs w:val="24"/>
+                <w:lang w:eastAsia="es-EC"/>
+              </w:rPr>
+              <w:t>da en el análisis.</w:t>
+            </w:r>
+          </w:p>
+        </w:tc>
+      </w:tr>
+      <w:tr>
+        <w:tc>
+          <w:tcPr>
+            <w:tcW w:w="3900" w:type="dxa"/>
+          </w:tcPr>
+          <w:p>
+            <w:pPr>
+              <w:spacing w:before="100" w:beforeAutospacing="1" w:after="100" w:afterAutospacing="1"/>
+              <w:jc w:val="both"/>
+              <w:rPr>
+                <w:rFonts w:ascii="Times New Roman" w:eastAsia="Times New Roman" w:hAnsi="Times New Roman" w:cs="Times New Roman"/>
+                <w:sz w:val="24"/>
+                <w:szCs w:val="24"/>
+                <w:lang w:eastAsia="es-EC"/>
+              </w:rPr>
+            </w:pPr>
+            <w:r>
+              <w:rPr>
+                <w:rFonts w:ascii="Times New Roman" w:eastAsia="Times New Roman" w:hAnsi="Times New Roman" w:cs="Times New Roman"/>
+                <w:sz w:val="24"/>
+                <w:szCs w:val="24"/>
+                <w:lang w:eastAsia="es-EC"/>
+              </w:rPr>
+              <w:t>obtenerActivo() reinicia el builder al terminar.</w:t>
+            </w:r>
+          </w:p>
+        </w:tc>
+        <w:tc>
+          <w:tcPr>
+            <w:tcW w:w="5167" w:type="dxa"/>
+          </w:tcPr>
+          <w:p>
+            <w:pPr>
+              <w:spacing w:before="100" w:beforeAutospacing="1" w:after="100" w:afterAutospacing="1"/>
+              <w:jc w:val="both"/>
+              <w:rPr>
+                <w:rFonts w:ascii="Times New Roman" w:eastAsia="Times New Roman" w:hAnsi="Times New Roman" w:cs="Times New Roman"/>
+                <w:sz w:val="24"/>
+                <w:szCs w:val="24"/>
+                <w:lang w:eastAsia="es-EC"/>
+              </w:rPr>
+            </w:pPr>
+            <w:r>
+              <w:rPr>
+                <w:rFonts w:ascii="Times New Roman" w:eastAsia="Times New Roman" w:hAnsi="Times New Roman" w:cs="Times New Roman"/>
+                <w:sz w:val="24"/>
+                <w:szCs w:val="24"/>
+                <w:lang w:eastAsia="es-EC"/>
+              </w:rPr>
+              <w:t>Permite construir otro activo con el mismo builder sin arrastrar datos del anterior.</w:t>
+            </w:r>
+          </w:p>
+        </w:tc>
+      </w:tr>
+      <w:tr>
+        <w:tc>
+          <w:tcPr>
+            <w:tcW w:w="3900" w:type="dxa"/>
+          </w:tcPr>
+          <w:p>
+            <w:pPr>
+              <w:spacing w:before="100" w:beforeAutospacing="1" w:after="100" w:afterAutospacing="1"/>
+              <w:jc w:val="both"/>
+              <w:rPr>
+                <w:rFonts w:ascii="Times New Roman" w:eastAsia="Times New Roman" w:hAnsi="Times New Roman" w:cs="Times New Roman"/>
+                <w:sz w:val="24"/>
+                <w:szCs w:val="24"/>
+                <w:lang w:eastAsia="es-EC"/>
+              </w:rPr>
+            </w:pPr>
+            <w:r>
+              <w:rPr>
+                <w:rFonts w:ascii="Times New Roman" w:eastAsia="Times New Roman" w:hAnsi="Times New Roman" w:cs="Times New Roman"/>
+                <w:sz w:val="24"/>
+                <w:szCs w:val="24"/>
+                <w:lang w:eastAsia="es-EC"/>
+              </w:rPr>
+              <w:t>establecerGarantia rechaza valores negativos y establecerCaracteristica rechaza claves vacías.</w:t>
+            </w:r>
+          </w:p>
+        </w:tc>
+        <w:tc>
+          <w:tcPr>
+            <w:tcW w:w="5167" w:type="dxa"/>
+          </w:tcPr>
+          <w:p>
+            <w:pPr>
+              <w:spacing w:before="100" w:beforeAutospacing="1" w:after="100" w:afterAutospacing="1"/>
+              <w:jc w:val="both"/>
+              <w:rPr>
+                <w:rFonts w:ascii="Times New Roman" w:eastAsia="Times New Roman" w:hAnsi="Times New Roman" w:cs="Times New Roman"/>
+                <w:sz w:val="24"/>
+                <w:szCs w:val="24"/>
+                <w:lang w:eastAsia="es-EC"/>
+              </w:rPr>
+            </w:pPr>
+            <w:r>
+              <w:rPr>
+                <w:rFonts w:ascii="Times New Roman" w:eastAsia="Times New Roman" w:hAnsi="Times New Roman" w:cs="Times New Roman"/>
+                <w:sz w:val="24"/>
+                <w:szCs w:val="24"/>
+                <w:lang w:eastAsia="es-EC"/>
+              </w:rPr>
+              <w:t xml:space="preserve">Evita </w:t>
+            </w:r>
+            <w:r>
+              <w:rPr>
+                <w:rFonts w:ascii="Times New Roman" w:eastAsia="Times New Roman" w:hAnsi="Times New Roman" w:cs="Times New Roman"/>
+                <w:sz w:val="24"/>
+                <w:szCs w:val="24"/>
+                <w:lang w:eastAsia="es-EC"/>
+              </w:rPr>
+              <w:t>datos opcionales incoherentes.</w:t>
+            </w:r>
+          </w:p>
+        </w:tc>
+      </w:tr>
+      <w:tr>
+        <w:tc>
+          <w:tcPr>
+            <w:tcW w:w="3900" w:type="dxa"/>
+          </w:tcPr>
+          <w:p>
+            <w:pPr>
+              <w:spacing w:before="100" w:beforeAutospacing="1" w:after="100" w:afterAutospacing="1"/>
+              <w:jc w:val="both"/>
+              <w:rPr>
+                <w:rFonts w:ascii="Times New Roman" w:eastAsia="Times New Roman" w:hAnsi="Times New Roman" w:cs="Times New Roman"/>
+                <w:sz w:val="24"/>
+                <w:szCs w:val="24"/>
+                <w:lang w:eastAsia="es-EC"/>
+              </w:rPr>
+            </w:pPr>
+            <w:r>
+              <w:rPr>
+                <w:rFonts w:ascii="Times New Roman" w:eastAsia="Times New Roman" w:hAnsi="Times New Roman" w:cs="Times New Roman"/>
+                <w:sz w:val="24"/>
+                <w:szCs w:val="24"/>
+                <w:lang w:eastAsia="es-EC"/>
+              </w:rPr>
+              <w:t>DirectorActivoFijo.construirBase() invoca iniciarConstruccion() antes de fijar los obligatorios y el constructor valida que el builder no sea nulo.</w:t>
+            </w:r>
+          </w:p>
+        </w:tc>
+        <w:tc>
+          <w:tcPr>
+            <w:tcW w:w="5167" w:type="dxa"/>
+          </w:tcPr>
+          <w:p>
+            <w:pPr>
+              <w:spacing w:before="100" w:beforeAutospacing="1" w:after="100" w:afterAutospacing="1"/>
+              <w:jc w:val="both"/>
+              <w:rPr>
+                <w:rFonts w:ascii="Times New Roman" w:eastAsia="Times New Roman" w:hAnsi="Times New Roman" w:cs="Times New Roman"/>
+                <w:sz w:val="24"/>
+                <w:szCs w:val="24"/>
+                <w:lang w:eastAsia="es-EC"/>
+              </w:rPr>
+            </w:pPr>
+            <w:r>
+              <w:rPr>
+                <w:rFonts w:ascii="Times New Roman" w:eastAsia="Times New Roman" w:hAnsi="Times New Roman" w:cs="Times New Roman"/>
+                <w:sz w:val="24"/>
+                <w:szCs w:val="24"/>
+                <w:lang w:eastAsia="es-EC"/>
+              </w:rPr>
+              <w:t>Asegura que cada construcción parta de un estado limpio.</w:t>
+            </w:r>
+          </w:p>
+        </w:tc>
+      </w:tr>
+      <w:tr>
+        <w:tc>
+          <w:tcPr>
+            <w:tcW w:w="3900" w:type="dxa"/>
+          </w:tcPr>
+          <w:p>
+            <w:pPr>
+              <w:spacing w:before="100" w:beforeAutospacing="1" w:after="100" w:afterAutospacing="1"/>
+              <w:jc w:val="both"/>
+              <w:rPr>
+                <w:rFonts w:ascii="Times New Roman" w:eastAsia="Times New Roman" w:hAnsi="Times New Roman" w:cs="Times New Roman"/>
+                <w:sz w:val="24"/>
+                <w:szCs w:val="24"/>
+                <w:lang w:eastAsia="es-EC"/>
+              </w:rPr>
+            </w:pPr>
+            <w:r>
+              <w:rPr>
+                <w:rFonts w:ascii="Times New Roman" w:eastAsia="Times New Roman" w:hAnsi="Times New Roman" w:cs="Times New Roman"/>
+                <w:sz w:val="24"/>
+                <w:szCs w:val="24"/>
+                <w:lang w:eastAsia="es-EC"/>
+              </w:rPr>
+              <w:t>Los métodos del bu</w:t>
+            </w:r>
+            <w:r>
+              <w:rPr>
+                <w:rFonts w:ascii="Times New Roman" w:eastAsia="Times New Roman" w:hAnsi="Times New Roman" w:cs="Times New Roman"/>
+                <w:sz w:val="24"/>
+                <w:szCs w:val="24"/>
+                <w:lang w:eastAsia="es-EC"/>
+              </w:rPr>
+              <w:t>ilder se mantienen como void (builder clásico).</w:t>
+            </w:r>
+          </w:p>
+        </w:tc>
+        <w:tc>
+          <w:tcPr>
+            <w:tcW w:w="5167" w:type="dxa"/>
+          </w:tcPr>
+          <w:p>
+            <w:pPr>
+              <w:spacing w:before="100" w:beforeAutospacing="1" w:after="100" w:afterAutospacing="1"/>
+              <w:jc w:val="both"/>
+              <w:rPr>
+                <w:rFonts w:ascii="Times New Roman" w:eastAsia="Times New Roman" w:hAnsi="Times New Roman" w:cs="Times New Roman"/>
+                <w:sz w:val="24"/>
+                <w:szCs w:val="24"/>
+                <w:lang w:eastAsia="es-EC"/>
+              </w:rPr>
+            </w:pPr>
+            <w:r>
+              <w:rPr>
+                <w:rFonts w:ascii="Times New Roman" w:eastAsia="Times New Roman" w:hAnsi="Times New Roman" w:cs="Times New Roman"/>
+                <w:sz w:val="24"/>
+                <w:szCs w:val="24"/>
+                <w:lang w:eastAsia="es-EC"/>
+              </w:rPr>
+              <w:t>Coincide con el diagrama y con la participación del Director; el estilo encadenado (variante moderna) haría innecesario al Director.</w:t>
+            </w:r>
+          </w:p>
+        </w:tc>
+      </w:tr>
+      <w:tr>
+        <w:tc>
+          <w:tcPr>
+            <w:tcW w:w="3900" w:type="dxa"/>
+          </w:tcPr>
+          <w:p>
+            <w:pPr>
+              <w:spacing w:before="100" w:beforeAutospacing="1" w:after="100" w:afterAutospacing="1"/>
+              <w:jc w:val="both"/>
+              <w:rPr>
+                <w:rFonts w:ascii="Times New Roman" w:eastAsia="Times New Roman" w:hAnsi="Times New Roman" w:cs="Times New Roman"/>
+                <w:sz w:val="24"/>
+                <w:szCs w:val="24"/>
+                <w:lang w:eastAsia="es-EC"/>
+              </w:rPr>
+            </w:pPr>
+            <w:r>
+              <w:rPr>
+                <w:rFonts w:ascii="Times New Roman" w:eastAsia="Times New Roman" w:hAnsi="Times New Roman" w:cs="Times New Roman"/>
+                <w:sz w:val="24"/>
+                <w:szCs w:val="24"/>
+                <w:lang w:eastAsia="es-EC"/>
+              </w:rPr>
+              <w:t>Se agregó Main.java que usa el Director para la base y el builder directam</w:t>
+            </w:r>
+            <w:r>
+              <w:rPr>
+                <w:rFonts w:ascii="Times New Roman" w:eastAsia="Times New Roman" w:hAnsi="Times New Roman" w:cs="Times New Roman"/>
+                <w:sz w:val="24"/>
+                <w:szCs w:val="24"/>
+                <w:lang w:eastAsia="es-EC"/>
+              </w:rPr>
+              <w:t>ente para los opcionales y las características técnicas.</w:t>
+            </w:r>
+          </w:p>
+        </w:tc>
+        <w:tc>
+          <w:tcPr>
+            <w:tcW w:w="5167" w:type="dxa"/>
+          </w:tcPr>
+          <w:p>
+            <w:pPr>
+              <w:spacing w:before="100" w:beforeAutospacing="1" w:after="100" w:afterAutospacing="1"/>
+              <w:jc w:val="both"/>
+              <w:rPr>
+                <w:rFonts w:ascii="Times New Roman" w:eastAsia="Times New Roman" w:hAnsi="Times New Roman" w:cs="Times New Roman"/>
+                <w:sz w:val="24"/>
+                <w:szCs w:val="24"/>
+                <w:lang w:eastAsia="es-EC"/>
+              </w:rPr>
+            </w:pPr>
+            <w:r>
+              <w:rPr>
+                <w:rFonts w:ascii="Times New Roman" w:eastAsia="Times New Roman" w:hAnsi="Times New Roman" w:cs="Times New Roman"/>
+                <w:sz w:val="24"/>
+                <w:szCs w:val="24"/>
+                <w:lang w:eastAsia="es-EC"/>
+              </w:rPr>
+              <w:t>Demuestra la construcción paso a paso del enunciado.</w:t>
+            </w:r>
+          </w:p>
+        </w:tc>
+      </w:tr>
+    </w:tbl>
+    <w:p>
+      <w:pPr>
+        <w:jc w:val="both"/>
+        <w:rPr>
+          <w:rFonts w:ascii="Times New Roman" w:eastAsia="Times New Roman" w:hAnsi="Times New Roman" w:cs="Times New Roman"/>
+          <w:sz w:val="24"/>
+          <w:szCs w:val="24"/>
+          <w:lang w:eastAsia="es-EC"/>
+        </w:rPr>
+      </w:pPr>
+    </w:p>
+    <w:p>
+      <w:pPr>
+        <w:jc w:val="both"/>
+        <w:rPr>
+          <w:rFonts w:ascii="Times New Roman" w:eastAsia="Times New Roman" w:hAnsi="Times New Roman" w:cs="Times New Roman"/>
+          <w:b/>
+          <w:bCs/>
+          <w:sz w:val="24"/>
+          <w:szCs w:val="24"/>
+          <w:lang w:eastAsia="es-EC"/>
+        </w:rPr>
+      </w:pPr>
+      <w:r>
+        <w:rPr>
+          <w:rFonts w:ascii="Times New Roman" w:eastAsia="Times New Roman" w:hAnsi="Times New Roman" w:cs="Times New Roman"/>
+          <w:b/>
+          <w:bCs/>
+          <w:sz w:val="24"/>
+          <w:szCs w:val="24"/>
+          <w:lang w:eastAsia="es-EC"/>
+        </w:rPr>
+        <w:t>Conclusiones de la actividad</w:t>
+      </w:r>
+    </w:p>
+    <w:p>
+      <w:pPr>
+        <w:spacing w:before="100" w:beforeAutospacing="1" w:after="100" w:afterAutospacing="1" w:line="240" w:lineRule="auto"/>
+        <w:jc w:val="both"/>
+        <w:rPr>
+          <w:rFonts w:ascii="Times New Roman" w:eastAsia="Times New Roman" w:hAnsi="Times New Roman" w:cs="Times New Roman"/>
+          <w:sz w:val="24"/>
+          <w:szCs w:val="24"/>
+          <w:lang w:eastAsia="es-EC"/>
+        </w:rPr>
+      </w:pPr>
+      <w:r>
+        <w:rPr>
+          <w:rFonts w:ascii="Times New Roman" w:eastAsia="Times New Roman" w:hAnsi="Times New Roman" w:cs="Times New Roman"/>
+          <w:sz w:val="24"/>
+          <w:szCs w:val="24"/>
+          <w:lang w:eastAsia="es-EC"/>
+        </w:rPr>
+        <w:t>Esta actividad nos ayudó a entender que el enunciado puede dar pistas importantes para elegir un patrón de diseño. En el primer escenario, la necesidad de crear distintos tipos de vehículos durante la ejecución y evitar depender directamente de clases conc</w:t>
+      </w:r>
+      <w:r>
+        <w:rPr>
+          <w:rFonts w:ascii="Times New Roman" w:eastAsia="Times New Roman" w:hAnsi="Times New Roman" w:cs="Times New Roman"/>
+          <w:sz w:val="24"/>
+          <w:szCs w:val="24"/>
+          <w:lang w:eastAsia="es-EC"/>
+        </w:rPr>
+        <w:t>retas hizo que Factory Method sea una buena opción. De esta forma, el cliente trabaja con CreadorVehiculo y Vehiculo, y se pueden agregar nuevos tipos sin modificar la lógica principal.</w:t>
+      </w:r>
+    </w:p>
+    <w:p>
+      <w:pPr>
+        <w:spacing w:before="100" w:beforeAutospacing="1" w:after="100" w:afterAutospacing="1" w:line="240" w:lineRule="auto"/>
+        <w:jc w:val="both"/>
+        <w:rPr>
+          <w:rFonts w:ascii="Times New Roman" w:eastAsia="Times New Roman" w:hAnsi="Times New Roman" w:cs="Times New Roman"/>
+          <w:sz w:val="24"/>
+          <w:szCs w:val="24"/>
+          <w:lang w:eastAsia="es-EC"/>
+        </w:rPr>
+      </w:pPr>
+      <w:r>
+        <w:rPr>
+          <w:rFonts w:ascii="Times New Roman" w:eastAsia="Times New Roman" w:hAnsi="Times New Roman" w:cs="Times New Roman"/>
+          <w:sz w:val="24"/>
+          <w:szCs w:val="24"/>
+          <w:lang w:eastAsia="es-EC"/>
+        </w:rPr>
+        <w:t>En el segundo escenario, Builder fue más adecuado porque existían atri</w:t>
+      </w:r>
+      <w:r>
+        <w:rPr>
+          <w:rFonts w:ascii="Times New Roman" w:eastAsia="Times New Roman" w:hAnsi="Times New Roman" w:cs="Times New Roman"/>
+          <w:sz w:val="24"/>
+          <w:szCs w:val="24"/>
+          <w:lang w:eastAsia="es-EC"/>
+        </w:rPr>
+        <w:t>butos obligatorios y opcionales. Este patrón permite construir el objeto paso a paso y evita constructores demasiado largos o difíciles de mantener.</w:t>
+      </w:r>
+    </w:p>
+    <w:p>
+      <w:pPr>
+        <w:spacing w:before="100" w:beforeAutospacing="1" w:after="100" w:afterAutospacing="1" w:line="240" w:lineRule="auto"/>
+        <w:jc w:val="both"/>
+        <w:rPr>
+          <w:rFonts w:ascii="Times New Roman" w:eastAsia="Times New Roman" w:hAnsi="Times New Roman" w:cs="Times New Roman"/>
+          <w:sz w:val="24"/>
+          <w:szCs w:val="24"/>
+          <w:lang w:eastAsia="es-EC"/>
+        </w:rPr>
+      </w:pPr>
+      <w:r>
+        <w:rPr>
+          <w:rFonts w:ascii="Times New Roman" w:eastAsia="Times New Roman" w:hAnsi="Times New Roman" w:cs="Times New Roman"/>
+          <w:sz w:val="24"/>
+          <w:szCs w:val="24"/>
+          <w:lang w:eastAsia="es-EC"/>
+        </w:rPr>
+        <w:t xml:space="preserve">La IA sirvió como apoyo para obtener una primera propuesta, pero varias decisiones tuvieron que ser revisadas y ajustadas según el enunciado. Por ejemplo, se mantuvo Vehiculo como </w:t>
+      </w:r>
+      <w:r>
+        <w:rPr>
+          <w:rFonts w:ascii="Times New Roman" w:eastAsia="Times New Roman" w:hAnsi="Times New Roman" w:cs="Times New Roman"/>
+          <w:sz w:val="24"/>
+          <w:szCs w:val="24"/>
+          <w:lang w:eastAsia="es-EC"/>
+        </w:rPr>
+        <w:lastRenderedPageBreak/>
+        <w:t>clase abstracta y una sola clase ActivoFijo, mientras que se modificaron asp</w:t>
+      </w:r>
+      <w:r>
+        <w:rPr>
+          <w:rFonts w:ascii="Times New Roman" w:eastAsia="Times New Roman" w:hAnsi="Times New Roman" w:cs="Times New Roman"/>
+          <w:sz w:val="24"/>
+          <w:szCs w:val="24"/>
+          <w:lang w:eastAsia="es-EC"/>
+        </w:rPr>
+        <w:t>ectos como los parámetros de crearVehiculo() y las características técnicas.</w:t>
+      </w:r>
+    </w:p>
+    <w:p>
+      <w:pPr>
+        <w:spacing w:before="100" w:beforeAutospacing="1" w:after="100" w:afterAutospacing="1" w:line="240" w:lineRule="auto"/>
+        <w:jc w:val="both"/>
+        <w:rPr>
+          <w:rFonts w:ascii="Times New Roman" w:eastAsia="Times New Roman" w:hAnsi="Times New Roman" w:cs="Times New Roman"/>
+          <w:sz w:val="24"/>
+          <w:szCs w:val="24"/>
+          <w:lang w:eastAsia="es-EC"/>
+        </w:rPr>
+      </w:pPr>
+      <w:r>
+        <w:rPr>
+          <w:rFonts w:ascii="Times New Roman" w:eastAsia="Times New Roman" w:hAnsi="Times New Roman" w:cs="Times New Roman"/>
+          <w:sz w:val="24"/>
+          <w:szCs w:val="24"/>
+          <w:lang w:eastAsia="es-EC"/>
+        </w:rPr>
+        <w:t>Durante la implementación también se ajustó el UML para que coincida con el código. En general, ambos patrones agregan más clases, pero permiten tener una solución más clara, orga</w:t>
+      </w:r>
+      <w:r>
+        <w:rPr>
+          <w:rFonts w:ascii="Times New Roman" w:eastAsia="Times New Roman" w:hAnsi="Times New Roman" w:cs="Times New Roman"/>
+          <w:sz w:val="24"/>
+          <w:szCs w:val="24"/>
+          <w:lang w:eastAsia="es-EC"/>
+        </w:rPr>
+        <w:t>nizada y mantenible.</w:t>
+      </w:r>
+    </w:p>
+    <w:p>
+      <w:pPr>
+        <w:spacing w:before="100" w:beforeAutospacing="1" w:after="100" w:afterAutospacing="1" w:line="240" w:lineRule="auto"/>
+        <w:jc w:val="both"/>
+        <w:rPr>
+          <w:rFonts w:ascii="Times New Roman" w:eastAsia="Times New Roman" w:hAnsi="Times New Roman" w:cs="Times New Roman"/>
+          <w:sz w:val="24"/>
+          <w:szCs w:val="24"/>
+          <w:lang w:eastAsia="es-EC"/>
+        </w:rPr>
+      </w:pPr>
+    </w:p>
+    <w:p>
+      <w:pPr>
+        <w:spacing w:before="100" w:beforeAutospacing="1" w:after="100" w:afterAutospacing="1" w:line="240" w:lineRule="auto"/>
+        <w:jc w:val="both"/>
+        <w:rPr>
+          <w:rFonts w:ascii="Times New Roman" w:eastAsia="Times New Roman" w:hAnsi="Times New Roman" w:cs="Times New Roman"/>
+          <w:b/>
+          <w:bCs/>
+          <w:sz w:val="24"/>
+          <w:szCs w:val="24"/>
+          <w:lang w:eastAsia="es-EC"/>
+        </w:rPr>
+      </w:pPr>
+      <w:r>
+        <w:rPr>
+          <w:rFonts w:ascii="Times New Roman" w:eastAsia="Times New Roman" w:hAnsi="Times New Roman" w:cs="Times New Roman"/>
+          <w:b/>
+          <w:bCs/>
+          <w:sz w:val="24"/>
+          <w:szCs w:val="24"/>
+          <w:lang w:eastAsia="es-EC"/>
+        </w:rPr>
+        <w:t xml:space="preserve">Código fuente: </w:t>
+      </w:r>
+    </w:p>
+    <w:p>
+      <w:pPr>
+        <w:spacing w:before="100" w:beforeAutospacing="1" w:after="100" w:afterAutospacing="1" w:line="240" w:lineRule="auto"/>
+        <w:jc w:val="both"/>
+        <w:rPr>
+          <w:rFonts w:ascii="Times New Roman" w:eastAsia="Times New Roman" w:hAnsi="Times New Roman" w:cs="Times New Roman"/>
+          <w:sz w:val="24"/>
+          <w:szCs w:val="24"/>
+          <w:lang w:eastAsia="es-EC"/>
+        </w:rPr>
+      </w:pPr>
+      <w:hyperlink r:id="rId12" w:history="1">
+        <w:r>
+          <w:rPr>
+            <w:rStyle w:val="Hipervnculo"/>
+            <w:rFonts w:ascii="Times New Roman" w:eastAsia="Times New Roman" w:hAnsi="Times New Roman" w:cs="Times New Roman"/>
+            <w:sz w:val="24"/>
+            <w:szCs w:val="24"/>
+            <w:lang w:eastAsia="es-EC"/>
+          </w:rPr>
+          <w:t>https://github.com/miguesj-hub/patrones-diseno-actividad-01</w:t>
+        </w:r>
+      </w:hyperlink>
+    </w:p>
+    <w:p>
+      <w:pPr>
+        <w:spacing w:before="100" w:beforeAutospacing="1" w:after="100" w:afterAutospacing="1" w:line="240" w:lineRule="auto"/>
+        <w:jc w:val="both"/>
+        <w:rPr>
+          <w:rFonts w:ascii="Times New Roman" w:eastAsia="Times New Roman" w:hAnsi="Times New Roman" w:cs="Times New Roman"/>
+          <w:sz w:val="24"/>
+          <w:szCs w:val="24"/>
+          <w:lang w:eastAsia="es-EC"/>
+        </w:rPr>
+      </w:pPr>
     </w:p>
     <w:sectPr>
       <w:pgSz w:w="11906" w:h="16838"/>
@@ -6972,6 +10390,7 @@
   <w:style w:type="paragraph" w:default="1" w:styleId="Normal">
     <w:name w:val="Normal"/>
     <w:qFormat/>
+    <w:rsid w:val="008D45DB"/>
   </w:style>
   <w:style w:type="character" w:default="1" w:styleId="Fuentedeprrafopredeter">
     <w:name w:val="Default Paragraph Font"/>
@@ -7091,6 +10510,25 @@
     <w:rPr>
       <w:color w:val="605E5C"/>
       <w:shd w:val="clear" w:color="auto" w:fill="E1DFDD"/>
+    </w:rPr>
+  </w:style>
+  <w:style w:type="paragraph" w:styleId="Descripcin">
+    <w:name w:val="caption"/>
+    <w:basedOn w:val="Normal"/>
+    <w:next w:val="Normal"/>
+    <w:uiPriority w:val="35"/>
+    <w:unhideWhenUsed/>
+    <w:qFormat/>
+    <w:rsid w:val="00A850BB"/>
+    <w:pPr>
+      <w:spacing w:after="200" w:line="240" w:lineRule="auto"/>
+    </w:pPr>
+    <w:rPr>
+      <w:i/>
+      <w:iCs/>
+      <w:color w:val="44546A" w:themeColor="text2"/>
+      <w:sz w:val="18"/>
+      <w:szCs w:val="18"/>
     </w:rPr>
   </w:style>
 </w:styles>
@@ -7389,4 +10827,16 @@
     </a:ext>
   </a:extLst>
 </a:theme>
+</file>
+
+<file path=customXml/item1.xml><?xml version="1.0" encoding="utf-8"?>
+<b:Sources xmlns:b="http://schemas.openxmlformats.org/officeDocument/2006/bibliography" xmlns="http://schemas.openxmlformats.org/officeDocument/2006/bibliography" SelectedStyle="\APASixthEditionOfficeOnline.xsl" StyleName="APA" Version="6"/>
+</file>
+
+<file path=customXml/itemProps1.xml><?xml version="1.0" encoding="utf-8"?>
+<ds:datastoreItem xmlns:ds="http://schemas.openxmlformats.org/officeDocument/2006/customXml" ds:itemID="{07876E4C-057A-485E-BA9D-6266AD9F15B9}">
+  <ds:schemaRefs>
+    <ds:schemaRef ds:uri="http://schemas.openxmlformats.org/officeDocument/2006/bibliography"/>
+  </ds:schemaRefs>
+</ds:datastoreItem>
 </file>
</xml_diff>